<commit_message>
Prepare EJNMMI submission package
Unify the EJNMMI submission source, add reproducible result/build scripts, update identifiability and kappa_lipid robustness text, correct water-reference sourcing, and regenerate the submission bundle.
</commit_message>
<xml_diff>
--- a/paper/manuscript_ejnmmi.docx
+++ b/paper/manuscript_ejnmmi.docx
@@ -2,7 +2,7 @@
 <file path=word/document.xml><?xml version="1.0" encoding="utf-8"?>
 <w:document xmlns:w="http://schemas.openxmlformats.org/wordprocessingml/2006/main" xmlns:m="http://schemas.openxmlformats.org/officeDocument/2006/math" xmlns:r="http://schemas.openxmlformats.org/officeDocument/2006/relationships" xmlns:o="urn:schemas-microsoft-com:office:office" xmlns:v="urn:schemas-microsoft-com:vml" xmlns:w10="urn:schemas-microsoft-com:office:word" xmlns:a="http://schemas.openxmlformats.org/drawingml/2006/main" xmlns:pic="http://schemas.openxmlformats.org/drawingml/2006/picture" xmlns:wp="http://schemas.openxmlformats.org/drawingml/2006/wordprocessingDrawing">
   <w:body>
-    <w:bookmarkStart w:id="46" w:name="X61181363d61859004ffa86d8771ae1e326a929c"/>
+    <w:bookmarkStart w:id="28" w:name="X61181363d61859004ffa86d8771ae1e326a929c"/>
     <w:p>
       <w:pPr>
         <w:pStyle w:val="Heading1"/>
@@ -125,7 +125,7 @@
         <w:t xml:space="preserve"> </w:t>
       </w:r>
       <w:r>
-        <w:t xml:space="preserve">Positronium lifetime imaging with long-axial-field-of-view PET/CT has been proposed as a biomarker of tissue oxygenation. The same lifetime, however, also depends on tissue composition. We quantified whether oxygenation and composition can be separated from positronium observables and what bias arises if composition is ignored.</w:t>
+        <w:t xml:space="preserve">Positronium lifetime imaging with long-axial-field-of-view PET/CT has been proposed as a biomarker of tissue oxygenation. The same lifetime also depends on tissue composition. We quantified whether oxygenation and composition can be separated from positronium observables, and what bias arises if composition is ignored.</w:t>
       </w:r>
     </w:p>
     <w:p>
@@ -163,7 +163,7 @@
         <w:t xml:space="preserve"> </w:t>
       </w:r>
       <w:r>
-        <w:t xml:space="preserve">and lipid fraction to the ortho-positronium lifetime</w:t>
+        <w:t xml:space="preserve">and lipid/free-volume fraction to the ortho-positronium lifetime</w:t>
       </w:r>
       <w:r>
         <w:t xml:space="preserve"> </w:t>
@@ -226,7 +226,30 @@
         <w:t xml:space="preserve"> </w:t>
       </w:r>
       <w:r>
-        <w:t xml:space="preserve">bias of a water-calibrated reader, analysed structural identifiability by Fisher information, computed Cramér-Rao bounds (CRLBs) for</w:t>
+        <w:t xml:space="preserve">bias of a water-calibrated reader, analysed Fisher-information rank for</w:t>
+      </w:r>
+      <w:r>
+        <w:t xml:space="preserve"> </w:t>
+      </w:r>
+      <m:oMath>
+        <m:sSub>
+          <m:e>
+            <m:r>
+              <m:t>τ</m:t>
+            </m:r>
+          </m:e>
+          <m:sub>
+            <m:r>
+              <m:t>3</m:t>
+            </m:r>
+          </m:sub>
+        </m:sSub>
+      </m:oMath>
+      <w:r>
+        <w:t xml:space="preserve"> </w:t>
+      </w:r>
+      <w:r>
+        <w:t xml:space="preserve">alone, computed Cramér-Rao bounds (CRLBs) for</w:t>
       </w:r>
       <w:r>
         <w:t xml:space="preserve"> </w:t>
@@ -273,60 +296,7 @@
         <w:t xml:space="preserve"> </w:t>
       </w:r>
       <w:r>
-        <w:t xml:space="preserve">from</w:t>
-      </w:r>
-      <w:r>
-        <w:t xml:space="preserve"> </w:t>
-      </w:r>
-      <m:oMath>
-        <m:r>
-          <m:rPr>
-            <m:sty m:val="p"/>
-          </m:rPr>
-          <m:t>(</m:t>
-        </m:r>
-        <m:sSub>
-          <m:e>
-            <m:r>
-              <m:t>τ</m:t>
-            </m:r>
-          </m:e>
-          <m:sub>
-            <m:r>
-              <m:t>3</m:t>
-            </m:r>
-          </m:sub>
-        </m:sSub>
-        <m:r>
-          <m:rPr>
-            <m:sty m:val="p"/>
-          </m:rPr>
-          <m:t>,</m:t>
-        </m:r>
-        <m:sSub>
-          <m:e>
-            <m:r>
-              <m:t>I</m:t>
-            </m:r>
-          </m:e>
-          <m:sub>
-            <m:r>
-              <m:t>3</m:t>
-            </m:r>
-          </m:sub>
-        </m:sSub>
-        <m:r>
-          <m:rPr>
-            <m:sty m:val="p"/>
-          </m:rPr>
-          <m:t>)</m:t>
-        </m:r>
-      </m:oMath>
-      <w:r>
-        <w:t xml:space="preserve"> </w:t>
-      </w:r>
-      <w:r>
-        <w:t xml:space="preserve">using a Poisson lifetime-spectrum model with nuisance profiling, and translated the bounds into counts and region-of-interest volumes.</w:t>
+        <w:t xml:space="preserve">from a Poisson lifetime-spectrum model with nuisance profiling, and translated the bounds into counts and region-of-interest volumes.</w:t>
       </w:r>
     </w:p>
     <w:p>
@@ -367,7 +337,7 @@
         <w:t xml:space="preserve"> </w:t>
       </w:r>
       <w:r>
-        <w:t xml:space="preserve">alone, oxygenation and composition are structurally non-identifiable because both enter a single summed decay rate. Ignoring composition produced apparent-pO</w:t>
+        <w:t xml:space="preserve">alone, oxygenation and composition were structurally non-identifiable because both enter one summed decay rate. Ignoring composition produced apparent-pO</w:t>
       </w:r>
       <m:oMath>
         <m:sSub>
@@ -387,7 +357,7 @@
         <w:t xml:space="preserve"> </w:t>
       </w:r>
       <w:r>
-        <w:t xml:space="preserve">errors of -178, -439 and -860 mmHg at 2%, 5% and 10% lipid for a tissue at 20 mmHg. Adding</w:t>
+        <w:t xml:space="preserve">errors of -178, -439 and -860 mmHg at 2%, 5% and 10% lipid for tissue at 20 mmHg. Adding</w:t>
       </w:r>
       <w:r>
         <w:t xml:space="preserve"> </w:t>
@@ -410,7 +380,172 @@
         <w:t xml:space="preserve"> </w:t>
       </w:r>
       <w:r>
-        <w:t xml:space="preserve">restored identifiability in principle, but the pO</w:t>
+        <w:t xml:space="preserve">restored identifiability in principle when the</w:t>
+      </w:r>
+      <w:r>
+        <w:t xml:space="preserve"> </w:t>
+      </w:r>
+      <m:oMath>
+        <m:r>
+          <m:rPr>
+            <m:sty m:val="p"/>
+          </m:rPr>
+          <m:t>(</m:t>
+        </m:r>
+        <m:sSub>
+          <m:e>
+            <m:r>
+              <m:t>λ</m:t>
+            </m:r>
+          </m:e>
+          <m:sub>
+            <m:r>
+              <m:t>3</m:t>
+            </m:r>
+          </m:sub>
+        </m:sSub>
+        <m:r>
+          <m:rPr>
+            <m:sty m:val="p"/>
+          </m:rPr>
+          <m:t>,</m:t>
+        </m:r>
+        <m:sSub>
+          <m:e>
+            <m:r>
+              <m:t>I</m:t>
+            </m:r>
+          </m:e>
+          <m:sub>
+            <m:r>
+              <m:t>3</m:t>
+            </m:r>
+          </m:sub>
+        </m:sSub>
+        <m:r>
+          <m:rPr>
+            <m:sty m:val="p"/>
+          </m:rPr>
+          <m:t>)</m:t>
+        </m:r>
+      </m:oMath>
+      <w:r>
+        <w:t xml:space="preserve"> </w:t>
+      </w:r>
+      <w:r>
+        <w:t xml:space="preserve">Jacobian was non-collinear; in the pessimistic baseline</w:t>
+      </w:r>
+      <w:r>
+        <w:t xml:space="preserve"> </w:t>
+      </w:r>
+      <m:oMath>
+        <m:r>
+          <m:rPr>
+            <m:sty m:val="p"/>
+          </m:rPr>
+          <m:t>∂</m:t>
+        </m:r>
+        <m:sSub>
+          <m:e>
+            <m:r>
+              <m:t>I</m:t>
+            </m:r>
+          </m:e>
+          <m:sub>
+            <m:r>
+              <m:t>3</m:t>
+            </m:r>
+          </m:sub>
+        </m:sSub>
+        <m:r>
+          <m:rPr>
+            <m:sty m:val="p"/>
+          </m:rPr>
+          <m:t>/</m:t>
+        </m:r>
+        <m:r>
+          <m:rPr>
+            <m:sty m:val="p"/>
+          </m:rPr>
+          <m:t>∂</m:t>
+        </m:r>
+        <m:r>
+          <m:t>p</m:t>
+        </m:r>
+        <m:sSub>
+          <m:e>
+            <m:r>
+              <m:t>O</m:t>
+            </m:r>
+          </m:e>
+          <m:sub>
+            <m:r>
+              <m:t>2</m:t>
+            </m:r>
+          </m:sub>
+        </m:sSub>
+        <m:r>
+          <m:rPr>
+            <m:sty m:val="p"/>
+          </m:rPr>
+          <m:t>≈</m:t>
+        </m:r>
+        <m:r>
+          <m:t>0</m:t>
+        </m:r>
+      </m:oMath>
+      <w:r>
+        <w:t xml:space="preserve">, this required</w:t>
+      </w:r>
+      <w:r>
+        <w:t xml:space="preserve"> </w:t>
+      </w:r>
+      <m:oMath>
+        <m:r>
+          <m:rPr>
+            <m:sty m:val="p"/>
+          </m:rPr>
+          <m:t>∂</m:t>
+        </m:r>
+        <m:sSub>
+          <m:e>
+            <m:r>
+              <m:t>I</m:t>
+            </m:r>
+          </m:e>
+          <m:sub>
+            <m:r>
+              <m:t>3</m:t>
+            </m:r>
+          </m:sub>
+        </m:sSub>
+        <m:r>
+          <m:rPr>
+            <m:sty m:val="p"/>
+          </m:rPr>
+          <m:t>/</m:t>
+        </m:r>
+        <m:r>
+          <m:rPr>
+            <m:sty m:val="p"/>
+          </m:rPr>
+          <m:t>∂</m:t>
+        </m:r>
+        <m:r>
+          <m:t>f</m:t>
+        </m:r>
+        <m:r>
+          <m:rPr>
+            <m:sty m:val="p"/>
+          </m:rPr>
+          <m:t>≠</m:t>
+        </m:r>
+        <m:r>
+          <m:t>0</m:t>
+        </m:r>
+      </m:oMath>
+      <w:r>
+        <w:t xml:space="preserve">. The pO</w:t>
       </w:r>
       <m:oMath>
         <m:sSub>
@@ -453,7 +588,7 @@
         <w:t xml:space="preserve"> </w:t>
       </w:r>
       <w:r>
-        <w:t xml:space="preserve">ortho-positronium counts. A 10 mmHg target required litres of pooled signal even in the best-yield scenario and was not achievable at 4 mm voxel scale.</w:t>
+        <w:t xml:space="preserve">o-Ps counts. A 10 mmHg target required litre-scale pooling in current yield scenarios and was unreachable at native 4 mm voxel scale.</w:t>
       </w:r>
     </w:p>
     <w:p>
@@ -543,7 +678,34 @@
         <w:pStyle w:val="BodyText"/>
       </w:pPr>
       <w:r>
-        <w:t xml:space="preserve">The positronium literature recognises this qualitatively: o-Ps lifetime reflects several phenomena, including oxygen, free radicals and free-volume structure [7]. What has been missing is a quantitative statement of whether oxygenation and composition are identifiable as separate variables, how large the apparent hypoxia bias can be, and how many counts would be needed to overcome the degeneracy with a second observable. Here we formulate the problem as an identifiability and CRLB analysis for an emerging nuclear-medicine biomarker. We quantify the bias produced by a lifetime-only, water-calibrated interpretation; test the structural rank of the lifetime-only inverse problem; evaluate whether adding o-Ps intensity</w:t>
+        <w:t xml:space="preserve">The relevant prior work has established the ingredients separately. Shibuya and Stepanov established oxygen quenching and its spin-conversion mechanism [1, 2]; Avachat et al. showed that lifetime separates soft tissues by composition/free-volume [7]; Moskal and Mercolli demonstrated in-vivo PLI and LAFOV feasibility [3-6]; photon-economy studies address estimation of a single lifetime [8, 9]; and 3</w:t>
+      </w:r>
+      <m:oMath>
+        <m:r>
+          <m:t>γ</m:t>
+        </m:r>
+      </m:oMath>
+      <w:r>
+        <w:t xml:space="preserve">/2</w:t>
+      </w:r>
+      <m:oMath>
+        <m:r>
+          <m:t>γ</m:t>
+        </m:r>
+      </m:oMath>
+      <w:r>
+        <w:t xml:space="preserve"> </w:t>
+      </w:r>
+      <w:r>
+        <w:t xml:space="preserve">oxygenation work motivates multi-observable readouts [10-12]. What has been missing is a quantitative statement of whether oxygenation and composition are identifiable as separate variables, how large the apparent hypoxia bias can be, and how many counts would be needed to overcome the degeneracy with a second observable.</w:t>
+      </w:r>
+    </w:p>
+    <w:p>
+      <w:pPr>
+        <w:pStyle w:val="BodyText"/>
+      </w:pPr>
+      <w:r>
+        <w:t xml:space="preserve">Here we formulate the problem as an identifiability and CRLB analysis for an emerging nuclear-medicine biomarker. We quantify the bias produced by a lifetime-only, water-calibrated interpretation; prove the structural rank defect of the lifetime-only inverse problem; evaluate whether adding o-Ps intensity</w:t>
       </w:r>
       <w:r>
         <w:t xml:space="preserve"> </w:t>
@@ -566,27 +728,17 @@
         <w:t xml:space="preserve"> </w:t>
       </w:r>
       <w:r>
-        <w:t xml:space="preserve">or a related</w:t>
-      </w:r>
-      <w:r>
-        <w:t xml:space="preserve"> </w:t>
-      </w:r>
-      <m:oMath>
-        <m:r>
-          <m:t>3</m:t>
-        </m:r>
+        <w:t xml:space="preserve">or a related 3</w:t>
+      </w:r>
+      <m:oMath>
         <m:r>
           <m:t>γ</m:t>
         </m:r>
-        <m:r>
-          <m:rPr>
-            <m:sty m:val="p"/>
-          </m:rPr>
-          <m:t>/</m:t>
-        </m:r>
-        <m:r>
-          <m:t>2</m:t>
-        </m:r>
+      </m:oMath>
+      <w:r>
+        <w:t xml:space="preserve">/2</w:t>
+      </w:r>
+      <m:oMath>
         <m:r>
           <m:t>γ</m:t>
         </m:r>
@@ -595,65 +747,17 @@
         <w:t xml:space="preserve"> </w:t>
       </w:r>
       <w:r>
-        <w:t xml:space="preserve">observable can break the degeneracy; and translate the resulting precision limits into clinically interpretable count and volume requirements.</w:t>
-      </w:r>
-    </w:p>
-    <w:p>
-      <w:pPr>
-        <w:pStyle w:val="BodyText"/>
-      </w:pPr>
-      <w:r>
-        <w:t xml:space="preserve">Prior 3</w:t>
-      </w:r>
-      <m:oMath>
-        <m:r>
-          <m:t>γ</m:t>
-        </m:r>
-      </m:oMath>
-      <w:r>
-        <w:t xml:space="preserve"> </w:t>
-      </w:r>
-      <w:r>
-        <w:t xml:space="preserve">oxygenation experiments and recent proposals for joint lifetime and</w:t>
-      </w:r>
-      <w:r>
-        <w:t xml:space="preserve"> </w:t>
-      </w:r>
-      <m:oMath>
-        <m:r>
-          <m:t>3</m:t>
-        </m:r>
-        <m:r>
-          <m:t>γ</m:t>
-        </m:r>
-        <m:r>
-          <m:rPr>
-            <m:sty m:val="p"/>
-          </m:rPr>
-          <m:t>/</m:t>
-        </m:r>
-        <m:r>
-          <m:t>2</m:t>
-        </m:r>
-        <m:r>
-          <m:t>γ</m:t>
-        </m:r>
-      </m:oMath>
-      <w:r>
-        <w:t xml:space="preserve"> </w:t>
-      </w:r>
-      <w:r>
-        <w:t xml:space="preserve">readouts motivate the use of a second observable [8-10]. A related single-subject cardiac PLI re-analysis reported an in-vivo lifetime contrast that was not explained by blood oxygenation, illustrating why the general identifiability problem matters in human data [11].</w:t>
+        <w:t xml:space="preserve">observable can break the degeneracy; and translate the resulting precision limits into count and volume requirements. A related single-subject cardiac PLI re-analysis reported an in-vivo lifetime contrast not explained by blood oxygenation, illustrating why the general identifiability problem matters in human data [13].</w:t>
       </w:r>
     </w:p>
     <w:bookmarkEnd w:id="10"/>
-    <w:bookmarkStart w:id="16" w:name="materials-and-methods"/>
+    <w:bookmarkStart w:id="16" w:name="material-and-methods"/>
     <w:p>
       <w:pPr>
         <w:pStyle w:val="Heading2"/>
       </w:pPr>
       <w:r>
-        <w:t xml:space="preserve">Materials and methods</w:t>
+        <w:t xml:space="preserve">Material and methods</w:t>
       </w:r>
     </w:p>
     <w:bookmarkStart w:id="11" w:name="forward-model"/>
@@ -878,7 +982,7 @@
         <w:t xml:space="preserve"> </w:t>
       </w:r>
       <w:r>
-        <w:t xml:space="preserve">is the lipid/free-volume-rich fraction of a two-compartment tissue,</w:t>
+        <w:t xml:space="preserve">is an effective lipid/free-volume-rich composition coordinate in a two-compartment tissue,</w:t>
       </w:r>
       <w:r>
         <w:t xml:space="preserve"> </w:t>
@@ -1021,7 +1125,27 @@
         <w:t xml:space="preserve"> </w:t>
       </w:r>
       <w:r>
-        <w:t xml:space="preserve">interpolated between water and lipid endpoints, and the lipid:water oxygen-solubility ratio was anchored to published oil/lipid measurements [12, 13]. The o-Ps intensity was modelled as</w:t>
+        <w:t xml:space="preserve">interpolated between water and lipid endpoints. The water endpoint was used as an operational PET/LAFOV water-reference lifetime, anchored to the 1.815 +/- 0.013 ns water measurement reported by Steinberger et al. [14] and consistent with the approximately 1.82 ns water-rich endpoint measured with</w:t>
+      </w:r>
+      <w:r>
+        <w:t xml:space="preserve"> </w:t>
+      </w:r>
+      <m:oMath>
+        <m:sSup>
+          <m:e>
+            <m:r>
+              <m:t>​</m:t>
+            </m:r>
+          </m:e>
+          <m:sup>
+            <m:r>
+              <m:t>124</m:t>
+            </m:r>
+          </m:sup>
+        </m:sSup>
+      </m:oMath>
+      <w:r>
+        <w:t xml:space="preserve">I PLI by Mercolli et al. [15], rather than as a universal deoxygenated pick-off constant. The lipid:water oxygen-solubility ratio was anchored to published oil/lipid measurements [16, 17]. The o-Ps intensity was modelled as</w:t>
       </w:r>
     </w:p>
     <w:p>
@@ -1320,7 +1444,7 @@
         </m:sSub>
       </m:oMath>
       <w:r>
-        <w:t xml:space="preserve">, swept over 0.1-1.0 times the water value, and the composition slope</w:t>
+        <w:t xml:space="preserve">, swept over 0.1-1.0 times the water value as a conservative baseline sweep, and the composition slope</w:t>
       </w:r>
       <w:r>
         <w:t xml:space="preserve"> </w:t>
@@ -1725,7 +1849,302 @@
         </m:sSub>
       </m:oMath>
       <w:r>
-        <w:t xml:space="preserve">, so the score vectors are collinear and the Fisher information has rank 1. With</w:t>
+        <w:t xml:space="preserve">. With the single score row</w:t>
+      </w:r>
+    </w:p>
+    <w:p>
+      <w:pPr>
+        <w:pStyle w:val="BodyText"/>
+      </w:pPr>
+      <m:oMathPara>
+        <m:oMathParaPr>
+          <m:jc m:val="center"/>
+        </m:oMathParaPr>
+        <m:oMath>
+          <m:r>
+            <m:t>J</m:t>
+          </m:r>
+          <m:r>
+            <m:rPr>
+              <m:sty m:val="p"/>
+            </m:rPr>
+            <m:t>=</m:t>
+          </m:r>
+          <m:r>
+            <m:rPr>
+              <m:sty m:val="p"/>
+            </m:rPr>
+            <m:t>[</m:t>
+          </m:r>
+          <m:r>
+            <m:t> </m:t>
+          </m:r>
+          <m:r>
+            <m:rPr>
+              <m:sty m:val="p"/>
+            </m:rPr>
+            <m:t>∂</m:t>
+          </m:r>
+          <m:sSub>
+            <m:e>
+              <m:r>
+                <m:t>λ</m:t>
+              </m:r>
+            </m:e>
+            <m:sub>
+              <m:r>
+                <m:t>3</m:t>
+              </m:r>
+            </m:sub>
+          </m:sSub>
+          <m:r>
+            <m:rPr>
+              <m:sty m:val="p"/>
+            </m:rPr>
+            <m:t>/</m:t>
+          </m:r>
+          <m:r>
+            <m:rPr>
+              <m:sty m:val="p"/>
+            </m:rPr>
+            <m:t>∂</m:t>
+          </m:r>
+          <m:r>
+            <m:t>p</m:t>
+          </m:r>
+          <m:sSub>
+            <m:e>
+              <m:r>
+                <m:t>O</m:t>
+              </m:r>
+            </m:e>
+            <m:sub>
+              <m:r>
+                <m:t>2</m:t>
+              </m:r>
+            </m:sub>
+          </m:sSub>
+          <m:r>
+            <m:rPr>
+              <m:sty m:val="p"/>
+            </m:rPr>
+            <m:t>,</m:t>
+          </m:r>
+          <m:r>
+            <m:t> </m:t>
+          </m:r>
+          <m:r>
+            <m:rPr>
+              <m:sty m:val="p"/>
+            </m:rPr>
+            <m:t>∂</m:t>
+          </m:r>
+          <m:sSub>
+            <m:e>
+              <m:r>
+                <m:t>λ</m:t>
+              </m:r>
+            </m:e>
+            <m:sub>
+              <m:r>
+                <m:t>3</m:t>
+              </m:r>
+            </m:sub>
+          </m:sSub>
+          <m:r>
+            <m:rPr>
+              <m:sty m:val="p"/>
+            </m:rPr>
+            <m:t>/</m:t>
+          </m:r>
+          <m:r>
+            <m:rPr>
+              <m:sty m:val="p"/>
+            </m:rPr>
+            <m:t>∂</m:t>
+          </m:r>
+          <m:r>
+            <m:t>f</m:t>
+          </m:r>
+          <m:r>
+            <m:t> </m:t>
+          </m:r>
+          <m:r>
+            <m:rPr>
+              <m:sty m:val="p"/>
+            </m:rPr>
+            <m:t>]</m:t>
+          </m:r>
+          <m:r>
+            <m:rPr>
+              <m:sty m:val="p"/>
+            </m:rPr>
+            <m:t>,</m:t>
+          </m:r>
+        </m:oMath>
+      </m:oMathPara>
+    </w:p>
+    <w:p>
+      <w:pPr>
+        <w:pStyle w:val="FirstParagraph"/>
+      </w:pPr>
+      <w:r>
+        <w:t xml:space="preserve">the lifetime-only Fisher information is</w:t>
+      </w:r>
+    </w:p>
+    <w:p>
+      <w:pPr>
+        <w:pStyle w:val="BodyText"/>
+      </w:pPr>
+      <m:oMathPara>
+        <m:oMathParaPr>
+          <m:jc m:val="center"/>
+        </m:oMathParaPr>
+        <m:oMath>
+          <m:sSub>
+            <m:e>
+              <m:r>
+                <m:t>F</m:t>
+              </m:r>
+            </m:e>
+            <m:sub>
+              <m:r>
+                <m:t>τ</m:t>
+              </m:r>
+            </m:sub>
+          </m:sSub>
+          <m:r>
+            <m:rPr>
+              <m:sty m:val="p"/>
+            </m:rPr>
+            <m:t>=</m:t>
+          </m:r>
+          <m:sSubSup>
+            <m:e>
+              <m:r>
+                <m:t>σ</m:t>
+              </m:r>
+            </m:e>
+            <m:sub>
+              <m:r>
+                <m:t>λ</m:t>
+              </m:r>
+            </m:sub>
+            <m:sup>
+              <m:r>
+                <m:rPr>
+                  <m:sty m:val="p"/>
+                </m:rPr>
+                <m:t>−</m:t>
+              </m:r>
+              <m:r>
+                <m:t>2</m:t>
+              </m:r>
+            </m:sup>
+          </m:sSubSup>
+          <m:sSup>
+            <m:e>
+              <m:r>
+                <m:t>J</m:t>
+              </m:r>
+            </m:e>
+            <m:sup>
+              <m:r>
+                <m:rPr>
+                  <m:sty m:val="p"/>
+                </m:rPr>
+                <m:t>⊤</m:t>
+              </m:r>
+            </m:sup>
+          </m:sSup>
+          <m:r>
+            <m:t>J</m:t>
+          </m:r>
+          <m:r>
+            <m:rPr>
+              <m:sty m:val="p"/>
+            </m:rPr>
+            <m:t>,</m:t>
+          </m:r>
+          <m:r>
+            <m:t>  </m:t>
+          </m:r>
+          <m:r>
+            <m:rPr>
+              <m:sty m:val="p"/>
+            </m:rPr>
+            <m:t>det</m:t>
+          </m:r>
+          <m:sSub>
+            <m:e>
+              <m:r>
+                <m:t>F</m:t>
+              </m:r>
+            </m:e>
+            <m:sub>
+              <m:r>
+                <m:t>τ</m:t>
+              </m:r>
+            </m:sub>
+          </m:sSub>
+          <m:r>
+            <m:rPr>
+              <m:sty m:val="p"/>
+            </m:rPr>
+            <m:t>=</m:t>
+          </m:r>
+          <m:r>
+            <m:t>0</m:t>
+          </m:r>
+          <m:r>
+            <m:rPr>
+              <m:sty m:val="p"/>
+            </m:rPr>
+            <m:t>.</m:t>
+          </m:r>
+        </m:oMath>
+      </m:oMathPara>
+    </w:p>
+    <w:p>
+      <w:pPr>
+        <w:pStyle w:val="FirstParagraph"/>
+      </w:pPr>
+      <w:r>
+        <w:t xml:space="preserve">Therefore the Fisher information has rank at most 1 and the individual CRLBs for pO</w:t>
+      </w:r>
+      <m:oMath>
+        <m:sSub>
+          <m:e>
+            <m:r>
+              <m:t>​</m:t>
+            </m:r>
+          </m:e>
+          <m:sub>
+            <m:r>
+              <m:t>2</m:t>
+            </m:r>
+          </m:sub>
+        </m:sSub>
+      </m:oMath>
+      <w:r>
+        <w:t xml:space="preserve"> </w:t>
+      </w:r>
+      <w:r>
+        <w:t xml:space="preserve">and</w:t>
+      </w:r>
+      <w:r>
+        <w:t xml:space="preserve"> </w:t>
+      </w:r>
+      <m:oMath>
+        <m:r>
+          <m:t>f</m:t>
+        </m:r>
+      </m:oMath>
+      <w:r>
+        <w:t xml:space="preserve"> </w:t>
+      </w:r>
+      <w:r>
+        <w:t xml:space="preserve">diverge. With</w:t>
       </w:r>
       <w:r>
         <w:t xml:space="preserve"> </w:t>
@@ -1775,17 +2194,26 @@
         </m:r>
       </m:oMath>
       <w:r>
-        <w:t xml:space="preserve">, the problem becomes identifiable only if the Jacobian of</w:t>
-      </w:r>
-      <w:r>
-        <w:t xml:space="preserve"> </w:t>
-      </w:r>
-      <m:oMath>
-        <m:r>
-          <m:rPr>
-            <m:sty m:val="p"/>
-          </m:rPr>
-          <m:t>(</m:t>
+        <w:t xml:space="preserve">, let</w:t>
+      </w:r>
+      <w:r>
+        <w:t xml:space="preserve"> </w:t>
+      </w:r>
+      <m:oMath>
+        <m:r>
+          <m:t>a</m:t>
+        </m:r>
+        <m:r>
+          <m:rPr>
+            <m:sty m:val="p"/>
+          </m:rPr>
+          <m:t>=</m:t>
+        </m:r>
+        <m:r>
+          <m:rPr>
+            <m:sty m:val="p"/>
+          </m:rPr>
+          <m:t>∂</m:t>
         </m:r>
         <m:sSub>
           <m:e>
@@ -1803,7 +2231,101 @@
           <m:rPr>
             <m:sty m:val="p"/>
           </m:rPr>
-          <m:t>,</m:t>
+          <m:t>/</m:t>
+        </m:r>
+        <m:r>
+          <m:rPr>
+            <m:sty m:val="p"/>
+          </m:rPr>
+          <m:t>∂</m:t>
+        </m:r>
+        <m:r>
+          <m:t>p</m:t>
+        </m:r>
+        <m:sSub>
+          <m:e>
+            <m:r>
+              <m:t>O</m:t>
+            </m:r>
+          </m:e>
+          <m:sub>
+            <m:r>
+              <m:t>2</m:t>
+            </m:r>
+          </m:sub>
+        </m:sSub>
+      </m:oMath>
+      <w:r>
+        <w:t xml:space="preserve">,</w:t>
+      </w:r>
+      <w:r>
+        <w:t xml:space="preserve"> </w:t>
+      </w:r>
+      <m:oMath>
+        <m:r>
+          <m:t>b</m:t>
+        </m:r>
+        <m:r>
+          <m:rPr>
+            <m:sty m:val="p"/>
+          </m:rPr>
+          <m:t>=</m:t>
+        </m:r>
+        <m:r>
+          <m:rPr>
+            <m:sty m:val="p"/>
+          </m:rPr>
+          <m:t>∂</m:t>
+        </m:r>
+        <m:sSub>
+          <m:e>
+            <m:r>
+              <m:t>λ</m:t>
+            </m:r>
+          </m:e>
+          <m:sub>
+            <m:r>
+              <m:t>3</m:t>
+            </m:r>
+          </m:sub>
+        </m:sSub>
+        <m:r>
+          <m:rPr>
+            <m:sty m:val="p"/>
+          </m:rPr>
+          <m:t>/</m:t>
+        </m:r>
+        <m:r>
+          <m:rPr>
+            <m:sty m:val="p"/>
+          </m:rPr>
+          <m:t>∂</m:t>
+        </m:r>
+        <m:r>
+          <m:t>f</m:t>
+        </m:r>
+      </m:oMath>
+      <w:r>
+        <w:t xml:space="preserve">,</w:t>
+      </w:r>
+      <w:r>
+        <w:t xml:space="preserve"> </w:t>
+      </w:r>
+      <m:oMath>
+        <m:r>
+          <m:t>p</m:t>
+        </m:r>
+        <m:r>
+          <m:rPr>
+            <m:sty m:val="p"/>
+          </m:rPr>
+          <m:t>=</m:t>
+        </m:r>
+        <m:r>
+          <m:rPr>
+            <m:sty m:val="p"/>
+          </m:rPr>
+          <m:t>∂</m:t>
         </m:r>
         <m:sSub>
           <m:e>
@@ -1821,24 +2343,13 @@
           <m:rPr>
             <m:sty m:val="p"/>
           </m:rPr>
-          <m:t>)</m:t>
-        </m:r>
-      </m:oMath>
-      <w:r>
-        <w:t xml:space="preserve"> </w:t>
-      </w:r>
-      <w:r>
-        <w:t xml:space="preserve">with respect to</w:t>
-      </w:r>
-      <w:r>
-        <w:t xml:space="preserve"> </w:t>
-      </w:r>
-      <m:oMath>
-        <m:r>
-          <m:rPr>
-            <m:sty m:val="p"/>
-          </m:rPr>
-          <m:t>(</m:t>
+          <m:t>/</m:t>
+        </m:r>
+        <m:r>
+          <m:rPr>
+            <m:sty m:val="p"/>
+          </m:rPr>
+          <m:t>∂</m:t>
         </m:r>
         <m:r>
           <m:t>p</m:t>
@@ -1855,27 +2366,256 @@
             </m:r>
           </m:sub>
         </m:sSub>
-        <m:r>
-          <m:rPr>
-            <m:sty m:val="p"/>
-          </m:rPr>
-          <m:t>,</m:t>
+      </m:oMath>
+      <w:r>
+        <w:t xml:space="preserve"> </w:t>
+      </w:r>
+      <w:r>
+        <w:t xml:space="preserve">and</w:t>
+      </w:r>
+      <w:r>
+        <w:t xml:space="preserve"> </w:t>
+      </w:r>
+      <m:oMath>
+        <m:r>
+          <m:t>c</m:t>
+        </m:r>
+        <m:r>
+          <m:rPr>
+            <m:sty m:val="p"/>
+          </m:rPr>
+          <m:t>=</m:t>
+        </m:r>
+        <m:r>
+          <m:rPr>
+            <m:sty m:val="p"/>
+          </m:rPr>
+          <m:t>∂</m:t>
+        </m:r>
+        <m:sSub>
+          <m:e>
+            <m:r>
+              <m:t>I</m:t>
+            </m:r>
+          </m:e>
+          <m:sub>
+            <m:r>
+              <m:t>3</m:t>
+            </m:r>
+          </m:sub>
+        </m:sSub>
+        <m:r>
+          <m:rPr>
+            <m:sty m:val="p"/>
+          </m:rPr>
+          <m:t>/</m:t>
+        </m:r>
+        <m:r>
+          <m:rPr>
+            <m:sty m:val="p"/>
+          </m:rPr>
+          <m:t>∂</m:t>
         </m:r>
         <m:r>
           <m:t>f</m:t>
         </m:r>
-        <m:r>
-          <m:rPr>
-            <m:sty m:val="p"/>
-          </m:rPr>
-          <m:t>)</m:t>
-        </m:r>
-      </m:oMath>
-      <w:r>
-        <w:t xml:space="preserve"> </w:t>
-      </w:r>
-      <w:r>
-        <w:t xml:space="preserve">is non-collinear.</w:t>
+      </m:oMath>
+      <w:r>
+        <w:t xml:space="preserve">. The two-observable problem is locally identifiable only when</w:t>
+      </w:r>
+    </w:p>
+    <w:p>
+      <w:pPr>
+        <w:pStyle w:val="BodyText"/>
+      </w:pPr>
+      <m:oMathPara>
+        <m:oMathParaPr>
+          <m:jc m:val="center"/>
+        </m:oMathParaPr>
+        <m:oMath>
+          <m:r>
+            <m:rPr>
+              <m:sty m:val="p"/>
+            </m:rPr>
+            <m:t>det</m:t>
+          </m:r>
+          <m:sSub>
+            <m:e>
+              <m:r>
+                <m:t>J</m:t>
+              </m:r>
+            </m:e>
+            <m:sub>
+              <m:r>
+                <m:t>λ</m:t>
+              </m:r>
+              <m:r>
+                <m:rPr>
+                  <m:sty m:val="p"/>
+                </m:rPr>
+                <m:t>,</m:t>
+              </m:r>
+              <m:r>
+                <m:t>I</m:t>
+              </m:r>
+            </m:sub>
+          </m:sSub>
+          <m:r>
+            <m:rPr>
+              <m:sty m:val="p"/>
+            </m:rPr>
+            <m:t>=</m:t>
+          </m:r>
+          <m:r>
+            <m:t>a</m:t>
+          </m:r>
+          <m:r>
+            <m:t> </m:t>
+          </m:r>
+          <m:r>
+            <m:t>c</m:t>
+          </m:r>
+          <m:r>
+            <m:rPr>
+              <m:sty m:val="p"/>
+            </m:rPr>
+            <m:t>−</m:t>
+          </m:r>
+          <m:r>
+            <m:t>b</m:t>
+          </m:r>
+          <m:r>
+            <m:t> </m:t>
+          </m:r>
+          <m:r>
+            <m:t>p</m:t>
+          </m:r>
+          <m:r>
+            <m:rPr>
+              <m:sty m:val="p"/>
+            </m:rPr>
+            <m:t>≠</m:t>
+          </m:r>
+          <m:r>
+            <m:t>0</m:t>
+          </m:r>
+          <m:r>
+            <m:rPr>
+              <m:sty m:val="p"/>
+            </m:rPr>
+            <m:t>,</m:t>
+          </m:r>
+        </m:oMath>
+      </m:oMathPara>
+    </w:p>
+    <w:p>
+      <w:pPr>
+        <w:pStyle w:val="FirstParagraph"/>
+      </w:pPr>
+      <w:r>
+        <w:t xml:space="preserve">which is the exact non-collinearity condition. In the pessimistic baseline</w:t>
+      </w:r>
+      <w:r>
+        <w:t xml:space="preserve"> </w:t>
+      </w:r>
+      <m:oMath>
+        <m:r>
+          <m:t>p</m:t>
+        </m:r>
+        <m:r>
+          <m:rPr>
+            <m:sty m:val="p"/>
+          </m:rPr>
+          <m:t>≈</m:t>
+        </m:r>
+        <m:r>
+          <m:t>0</m:t>
+        </m:r>
+      </m:oMath>
+      <w:r>
+        <w:t xml:space="preserve">, this reduces to</w:t>
+      </w:r>
+      <w:r>
+        <w:t xml:space="preserve"> </w:t>
+      </w:r>
+      <m:oMath>
+        <m:r>
+          <m:t>c</m:t>
+        </m:r>
+        <m:r>
+          <m:rPr>
+            <m:sty m:val="p"/>
+          </m:rPr>
+          <m:t>=</m:t>
+        </m:r>
+        <m:r>
+          <m:rPr>
+            <m:sty m:val="p"/>
+          </m:rPr>
+          <m:t>∂</m:t>
+        </m:r>
+        <m:sSub>
+          <m:e>
+            <m:r>
+              <m:t>I</m:t>
+            </m:r>
+          </m:e>
+          <m:sub>
+            <m:r>
+              <m:t>3</m:t>
+            </m:r>
+          </m:sub>
+        </m:sSub>
+        <m:r>
+          <m:rPr>
+            <m:sty m:val="p"/>
+          </m:rPr>
+          <m:t>/</m:t>
+        </m:r>
+        <m:r>
+          <m:rPr>
+            <m:sty m:val="p"/>
+          </m:rPr>
+          <m:t>∂</m:t>
+        </m:r>
+        <m:r>
+          <m:t>f</m:t>
+        </m:r>
+        <m:r>
+          <m:rPr>
+            <m:sty m:val="p"/>
+          </m:rPr>
+          <m:t>≠</m:t>
+        </m:r>
+        <m:r>
+          <m:t>0</m:t>
+        </m:r>
+      </m:oMath>
+      <w:r>
+        <w:t xml:space="preserve"> </w:t>
+      </w:r>
+      <w:r>
+        <w:t xml:space="preserve">because</w:t>
+      </w:r>
+      <w:r>
+        <w:t xml:space="preserve"> </w:t>
+      </w:r>
+      <m:oMath>
+        <m:r>
+          <m:t>a</m:t>
+        </m:r>
+        <m:r>
+          <m:rPr>
+            <m:sty m:val="p"/>
+          </m:rPr>
+          <m:t>≠</m:t>
+        </m:r>
+        <m:r>
+          <m:t>0</m:t>
+        </m:r>
+      </m:oMath>
+      <w:r>
+        <w:t xml:space="preserve">. This CRLB/identifiability framing follows the same logic used in other multi-parameter imaging inverse problems [19].</w:t>
       </w:r>
     </w:p>
     <w:bookmarkEnd w:id="13"/>
@@ -2350,7 +3090,7 @@
         <w:t xml:space="preserve"> </w:t>
       </w:r>
       <w:r>
-        <w:t xml:space="preserve">o-Ps counts in a 5.57 mL region [14]. We scaled o-Ps counts by region-of-interest volume and by scenario-level effective isotope-yield factors representing prompt branching and source-to-background conditions. The scenarios were</w:t>
+        <w:t xml:space="preserve">o-Ps counts in a 5.57 mL region [18]. We scaled o-Ps counts by region-of-interest volume and by scenario-level effective isotope-yield factors representing prompt branching and source-to-background conditions. The scenarios were</w:t>
       </w:r>
       <w:r>
         <w:t xml:space="preserve"> </w:t>
@@ -2427,7 +3167,7 @@
         </m:sSup>
       </m:oMath>
       <w:r>
-        <w:t xml:space="preserve">Rb (lower yield). For each tissue state, we computed the region volume required to reach</w:t>
+        <w:t xml:space="preserve">Rb (lower yield). These are planning scenarios, not universal scanner constants. For each tissue state, we computed the region volume required to reach</w:t>
       </w:r>
       <w:r>
         <w:t xml:space="preserve"> </w:t>
@@ -2513,7 +3253,7 @@
         <w:pStyle w:val="FirstParagraph"/>
       </w:pPr>
       <w:r>
-        <w:t xml:space="preserve">The composition-dependent lifetime shift dominated the oxygen-specific lifetime term. For a tissue truly at pO</w:t>
+        <w:t xml:space="preserve">The composition-dependent lifetime shift dominated the oxygen-specific lifetime term. For tissue truly at pO</w:t>
       </w:r>
       <m:oMath>
         <m:sSub>
@@ -2553,7 +3293,7 @@
         <w:t xml:space="preserve"> </w:t>
       </w:r>
       <w:r>
-        <w:t xml:space="preserve">errors of -178 mmHg at 2% lipid, -439 mmHg at 5% lipid and -860 mmHg at 10% lipid (Fig. 1). These values are physiologically implausible, indicating that the uncorrected lifetime read is composition-dominated rather than oxygen-specific.</w:t>
+        <w:t xml:space="preserve">errors of -178 mmHg at 2% lipid, -439 mmHg at 5% lipid and -860 mmHg at 10% lipid (Fig. 1). These values are physiologically implausible, indicating that the uncorrected lifetime read is composition-dominated rather than oxygen-specific. The result is conditional on the endpoint-mixing forward model, but not fragile: the bias scaled approximately linearly with the composition-to-lifetime coupling in sensitivity tests, and fell below 10 mmHg at 5% lipid only if that coupling was approximately 44-fold smaller than the measured water-adipose baseline gap.</w:t>
       </w:r>
     </w:p>
     <w:p>
@@ -2561,7 +3301,47 @@
         <w:pStyle w:val="BodyText"/>
       </w:pPr>
       <w:r>
-        <w:t xml:space="preserve">The oxygen sensitivity was also composition-dependent and uncertain because</w:t>
+        <w:t xml:space="preserve">The oxygen sensitivity was also composition-dependent, temperature-dependent and uncertain. At body temperature the aqueous sensitivity was approximately 0.09 ps/mmHg (O</w:t>
+      </w:r>
+      <m:oMath>
+        <m:sSub>
+          <m:e>
+            <m:r>
+              <m:t>​</m:t>
+            </m:r>
+          </m:e>
+          <m:sub>
+            <m:r>
+              <m:t>2</m:t>
+            </m:r>
+          </m:sub>
+        </m:sSub>
+      </m:oMath>
+      <w:r>
+        <w:t xml:space="preserve"> </w:t>
+      </w:r>
+      <w:r>
+        <w:t xml:space="preserve">solubility approximately 1.3 microM/mmHg at 37 degrees C), whereas the aqueous calibration of Shibuya et al. near room temperature (approximately 20 degrees C) implies approximately 0.13-0.14 ps/mmHg; the difference reflects the temperature dependence of O</w:t>
+      </w:r>
+      <m:oMath>
+        <m:sSub>
+          <m:e>
+            <m:r>
+              <m:t>​</m:t>
+            </m:r>
+          </m:e>
+          <m:sub>
+            <m:r>
+              <m:t>2</m:t>
+            </m:r>
+          </m:sub>
+        </m:sSub>
+      </m:oMath>
+      <w:r>
+        <w:t xml:space="preserve"> </w:t>
+      </w:r>
+      <w:r>
+        <w:t xml:space="preserve">solubility, and the smaller body-temperature value is the one relevant in vivo. Because</w:t>
       </w:r>
       <w:r>
         <w:t xml:space="preserve"> </w:t>
@@ -2611,7 +3391,7 @@
         <w:t xml:space="preserve"> </w:t>
       </w:r>
       <w:r>
-        <w:t xml:space="preserve">has not been measured in relevant lipid/protein environments. The model reproduced the aqueous sensitivity of approximately 0.09 ps/mmHg and predicted a net range of approximately 0.09-0.90 ps/mmHg in lipid-rich material across the</w:t>
+        <w:t xml:space="preserve">has not been measured in relevant lipid/protein environments, the conservative baseline model predicted a net range of approximately 0.09-0.90 ps/mmHg in lipid-rich material across the</w:t>
       </w:r>
       <w:r>
         <w:t xml:space="preserve"> </w:t>
@@ -2661,7 +3441,7 @@
         <w:t xml:space="preserve"> </w:t>
       </w:r>
       <w:r>
-        <w:t xml:space="preserve">sweep (Fig. 2). Thus, lipid affects both the baseline lifetime and the oxygen sensitivity.</w:t>
+        <w:t xml:space="preserve">sweep (Fig. 2).</w:t>
       </w:r>
     </w:p>
     <w:bookmarkEnd w:id="17"/>
@@ -2813,23 +3593,109 @@
         <w:t xml:space="preserve"> </w:t>
       </w:r>
       <w:r>
-        <w:t xml:space="preserve">while, in the pessimistic baseline model, oxygen moves only the rate. The formal condition is a non-collinear Jacobian for</w:t>
-      </w:r>
-      <w:r>
-        <w:t xml:space="preserve"> </w:t>
-      </w:r>
-      <m:oMath>
-        <m:r>
-          <m:rPr>
-            <m:sty m:val="p"/>
-          </m:rPr>
-          <m:t>(</m:t>
-        </m:r>
-        <m:sSub>
-          <m:e>
+        <w:t xml:space="preserve">while, in the pessimistic baseline model, oxygen moves only the rate. The exact local condition is</w:t>
+      </w:r>
+      <w:r>
+        <w:t xml:space="preserve"> </w:t>
+      </w:r>
+      <m:oMath>
+        <m:r>
+          <m:rPr>
+            <m:sty m:val="p"/>
+          </m:rPr>
+          <m:t>det</m:t>
+        </m:r>
+        <m:sSub>
+          <m:e>
+            <m:r>
+              <m:t>J</m:t>
+            </m:r>
+          </m:e>
+          <m:sub>
             <m:r>
               <m:t>λ</m:t>
             </m:r>
+            <m:r>
+              <m:rPr>
+                <m:sty m:val="p"/>
+              </m:rPr>
+              <m:t>,</m:t>
+            </m:r>
+            <m:r>
+              <m:t>I</m:t>
+            </m:r>
+          </m:sub>
+        </m:sSub>
+        <m:r>
+          <m:rPr>
+            <m:sty m:val="p"/>
+          </m:rPr>
+          <m:t>=</m:t>
+        </m:r>
+        <m:r>
+          <m:t>a</m:t>
+        </m:r>
+        <m:r>
+          <m:t> </m:t>
+        </m:r>
+        <m:r>
+          <m:t>c</m:t>
+        </m:r>
+        <m:r>
+          <m:rPr>
+            <m:sty m:val="p"/>
+          </m:rPr>
+          <m:t>−</m:t>
+        </m:r>
+        <m:r>
+          <m:t>b</m:t>
+        </m:r>
+        <m:r>
+          <m:t> </m:t>
+        </m:r>
+        <m:r>
+          <m:t>p</m:t>
+        </m:r>
+        <m:r>
+          <m:rPr>
+            <m:sty m:val="p"/>
+          </m:rPr>
+          <m:t>≠</m:t>
+        </m:r>
+        <m:r>
+          <m:t>0</m:t>
+        </m:r>
+      </m:oMath>
+      <w:r>
+        <w:t xml:space="preserve"> </w:t>
+      </w:r>
+      <w:r>
+        <w:t xml:space="preserve">(Fig. 3). In the baseline</w:t>
+      </w:r>
+      <w:r>
+        <w:t xml:space="preserve"> </w:t>
+      </w:r>
+      <m:oMath>
+        <m:r>
+          <m:t>p</m:t>
+        </m:r>
+        <m:r>
+          <m:rPr>
+            <m:sty m:val="p"/>
+          </m:rPr>
+          <m:t>=</m:t>
+        </m:r>
+        <m:r>
+          <m:rPr>
+            <m:sty m:val="p"/>
+          </m:rPr>
+          <m:t>∂</m:t>
+        </m:r>
+        <m:sSub>
+          <m:e>
+            <m:r>
+              <m:t>I</m:t>
+            </m:r>
           </m:e>
           <m:sub>
             <m:r>
@@ -2841,7 +3707,51 @@
           <m:rPr>
             <m:sty m:val="p"/>
           </m:rPr>
-          <m:t>,</m:t>
+          <m:t>/</m:t>
+        </m:r>
+        <m:r>
+          <m:rPr>
+            <m:sty m:val="p"/>
+          </m:rPr>
+          <m:t>∂</m:t>
+        </m:r>
+        <m:r>
+          <m:t>p</m:t>
+        </m:r>
+        <m:sSub>
+          <m:e>
+            <m:r>
+              <m:t>O</m:t>
+            </m:r>
+          </m:e>
+          <m:sub>
+            <m:r>
+              <m:t>2</m:t>
+            </m:r>
+          </m:sub>
+        </m:sSub>
+        <m:r>
+          <m:rPr>
+            <m:sty m:val="p"/>
+          </m:rPr>
+          <m:t>≈</m:t>
+        </m:r>
+        <m:r>
+          <m:t>0</m:t>
+        </m:r>
+      </m:oMath>
+      <w:r>
+        <w:t xml:space="preserve">, the condition reduces to</w:t>
+      </w:r>
+      <w:r>
+        <w:t xml:space="preserve"> </w:t>
+      </w:r>
+      <m:oMath>
+        <m:r>
+          <m:rPr>
+            <m:sty m:val="p"/>
+          </m:rPr>
+          <m:t>∂</m:t>
         </m:r>
         <m:sSub>
           <m:e>
@@ -2859,45 +3769,13 @@
           <m:rPr>
             <m:sty m:val="p"/>
           </m:rPr>
-          <m:t>)</m:t>
-        </m:r>
-      </m:oMath>
-      <w:r>
-        <w:t xml:space="preserve"> </w:t>
-      </w:r>
-      <w:r>
-        <w:t xml:space="preserve">with respect to</w:t>
-      </w:r>
-      <w:r>
-        <w:t xml:space="preserve"> </w:t>
-      </w:r>
-      <m:oMath>
-        <m:r>
-          <m:rPr>
-            <m:sty m:val="p"/>
-          </m:rPr>
-          <m:t>(</m:t>
-        </m:r>
-        <m:r>
-          <m:t>p</m:t>
-        </m:r>
-        <m:sSub>
-          <m:e>
-            <m:r>
-              <m:t>O</m:t>
-            </m:r>
-          </m:e>
-          <m:sub>
-            <m:r>
-              <m:t>2</m:t>
-            </m:r>
-          </m:sub>
-        </m:sSub>
-        <m:r>
-          <m:rPr>
-            <m:sty m:val="p"/>
-          </m:rPr>
-          <m:t>,</m:t>
+          <m:t>/</m:t>
+        </m:r>
+        <m:r>
+          <m:rPr>
+            <m:sty m:val="p"/>
+          </m:rPr>
+          <m:t>∂</m:t>
         </m:r>
         <m:r>
           <m:t>f</m:t>
@@ -2906,114 +3784,14 @@
           <m:rPr>
             <m:sty m:val="p"/>
           </m:rPr>
-          <m:t>)</m:t>
-        </m:r>
-      </m:oMath>
-      <w:r>
-        <w:t xml:space="preserve"> </w:t>
-      </w:r>
-      <w:r>
-        <w:t xml:space="preserve">(Fig. 3). If</w:t>
-      </w:r>
-      <w:r>
-        <w:t xml:space="preserve"> </w:t>
-      </w:r>
-      <m:oMath>
-        <m:r>
-          <m:rPr>
-            <m:sty m:val="p"/>
-          </m:rPr>
-          <m:t>∂</m:t>
-        </m:r>
-        <m:sSub>
-          <m:e>
-            <m:r>
-              <m:t>I</m:t>
-            </m:r>
-          </m:e>
-          <m:sub>
-            <m:r>
-              <m:t>3</m:t>
-            </m:r>
-          </m:sub>
-        </m:sSub>
-        <m:r>
-          <m:rPr>
-            <m:sty m:val="p"/>
-          </m:rPr>
-          <m:t>/</m:t>
-        </m:r>
-        <m:r>
-          <m:rPr>
-            <m:sty m:val="p"/>
-          </m:rPr>
-          <m:t>∂</m:t>
-        </m:r>
-        <m:r>
-          <m:t>f</m:t>
-        </m:r>
-      </m:oMath>
-      <w:r>
-        <w:t xml:space="preserve"> </w:t>
-      </w:r>
-      <w:r>
-        <w:t xml:space="preserve">approaches zero, the system again becomes degenerate. A non-zero</w:t>
-      </w:r>
-      <w:r>
-        <w:t xml:space="preserve"> </w:t>
-      </w:r>
-      <m:oMath>
-        <m:r>
-          <m:rPr>
-            <m:sty m:val="p"/>
-          </m:rPr>
-          <m:t>∂</m:t>
-        </m:r>
-        <m:sSub>
-          <m:e>
-            <m:r>
-              <m:t>I</m:t>
-            </m:r>
-          </m:e>
-          <m:sub>
-            <m:r>
-              <m:t>3</m:t>
-            </m:r>
-          </m:sub>
-        </m:sSub>
-        <m:r>
-          <m:rPr>
-            <m:sty m:val="p"/>
-          </m:rPr>
-          <m:t>/</m:t>
-        </m:r>
-        <m:r>
-          <m:rPr>
-            <m:sty m:val="p"/>
-          </m:rPr>
-          <m:t>∂</m:t>
-        </m:r>
-        <m:r>
-          <m:t>p</m:t>
-        </m:r>
-        <m:sSub>
-          <m:e>
-            <m:r>
-              <m:t>O</m:t>
-            </m:r>
-          </m:e>
-          <m:sub>
-            <m:r>
-              <m:t>2</m:t>
-            </m:r>
-          </m:sub>
-        </m:sSub>
-      </m:oMath>
-      <w:r>
-        <w:t xml:space="preserve"> </w:t>
-      </w:r>
-      <w:r>
-        <w:t xml:space="preserve">can help if it supplies an additional non-collinear direction, but it is not sufficient by itself if it remains aligned with the lifetime-rate response.</w:t>
+          <m:t>≠</m:t>
+        </m:r>
+        <m:r>
+          <m:t>0</m:t>
+        </m:r>
+      </m:oMath>
+      <w:r>
+        <w:t xml:space="preserve">; if that slope approaches zero, the system again becomes degenerate. The dependence on the composition slope was large even in the fixed-nuisance Poisson-spectrum model (Table 2).</w:t>
       </w:r>
     </w:p>
     <w:bookmarkEnd w:id="18"/>
@@ -3114,7 +3892,7 @@
         <w:t xml:space="preserve"> </w:t>
       </w:r>
       <w:r>
-        <w:t xml:space="preserve">CRLB remained large across noise models: 332 mmHg for the fixed-nuisance Poisson spectrum, 570 mmHg for an idealised two-observable model using the field’s empirical lifetime precision, 665 mmHg after profiling background and fast-component nuisances, and 758 mmHg after profiling all tested nuisances (Table 2). The spectral model also exposed substantial</w:t>
+        <w:t xml:space="preserve">CRLB remained large across noise models: 332 mmHg for the fixed-nuisance Poisson spectrum, 570 mmHg for an idealised two-observable model using empirical lifetime precision from the field, 665 mmHg after profiling background and fast-component nuisances, and 758 mmHg after profiling all tested nuisances (Table 3). The spectral model also exposed substantial</w:t>
       </w:r>
       <w:r>
         <w:t xml:space="preserve"> </w:t>
@@ -3622,297 +4400,12 @@
         <w:t xml:space="preserve">separation was not achievable anywhere in the virtual tumour phantom (Fig. 6).</w:t>
       </w:r>
     </w:p>
-    <w:bookmarkEnd w:id="20"/>
-    <w:bookmarkEnd w:id="21"/>
-    <w:bookmarkStart w:id="22" w:name="discussion"/>
-    <w:p>
-      <w:pPr>
-        <w:pStyle w:val="Heading2"/>
-      </w:pPr>
-      <w:r>
-        <w:t xml:space="preserve">Discussion</w:t>
-      </w:r>
-    </w:p>
-    <w:p>
-      <w:pPr>
-        <w:pStyle w:val="FirstParagraph"/>
-      </w:pPr>
-      <w:r>
-        <w:t xml:space="preserve">This analysis identifies a fundamental limitation for positronium-lifetime hypoxia imaging. Oxygen quenching of o-Ps is real, but a lifetime map is not an oxygenation map unless composition is controlled. From</w:t>
-      </w:r>
-      <w:r>
-        <w:t xml:space="preserve"> </w:t>
-      </w:r>
-      <m:oMath>
-        <m:sSub>
-          <m:e>
-            <m:r>
-              <m:t>τ</m:t>
-            </m:r>
-          </m:e>
-          <m:sub>
-            <m:r>
-              <m:t>3</m:t>
-            </m:r>
-          </m:sub>
-        </m:sSub>
-      </m:oMath>
-      <w:r>
-        <w:t xml:space="preserve"> </w:t>
-      </w:r>
-      <w:r>
-        <w:t xml:space="preserve">alone, oxygenation and composition collapse into a single measured decay rate, making the inverse problem structurally non-identifiable. This remains true even with arbitrarily many counts. The practical consequence is large apparent-pO</w:t>
-      </w:r>
-      <m:oMath>
-        <m:sSub>
-          <m:e>
-            <m:r>
-              <m:t>​</m:t>
-            </m:r>
-          </m:e>
-          <m:sub>
-            <m:r>
-              <m:t>2</m:t>
-            </m:r>
-          </m:sub>
-        </m:sSub>
-      </m:oMath>
-      <w:r>
-        <w:t xml:space="preserve"> </w:t>
-      </w:r>
-      <w:r>
-        <w:t xml:space="preserve">bias when composition is ignored.</w:t>
-      </w:r>
-    </w:p>
     <w:p>
       <w:pPr>
         <w:pStyle w:val="BodyText"/>
       </w:pPr>
       <w:r>
-        <w:t xml:space="preserve">The analysis is also constructive. It shows that a second observable, such as o-Ps intensity</w:t>
-      </w:r>
-      <w:r>
-        <w:t xml:space="preserve"> </w:t>
-      </w:r>
-      <m:oMath>
-        <m:sSub>
-          <m:e>
-            <m:r>
-              <m:t>I</m:t>
-            </m:r>
-          </m:e>
-          <m:sub>
-            <m:r>
-              <m:t>3</m:t>
-            </m:r>
-          </m:sub>
-        </m:sSub>
-      </m:oMath>
-      <w:r>
-        <w:t xml:space="preserve"> </w:t>
-      </w:r>
-      <w:r>
-        <w:t xml:space="preserve">or a related</w:t>
-      </w:r>
-      <w:r>
-        <w:t xml:space="preserve"> </w:t>
-      </w:r>
-      <m:oMath>
-        <m:r>
-          <m:t>3</m:t>
-        </m:r>
-        <m:r>
-          <m:t>γ</m:t>
-        </m:r>
-        <m:r>
-          <m:rPr>
-            <m:sty m:val="p"/>
-          </m:rPr>
-          <m:t>/</m:t>
-        </m:r>
-        <m:r>
-          <m:t>2</m:t>
-        </m:r>
-        <m:r>
-          <m:t>γ</m:t>
-        </m:r>
-      </m:oMath>
-      <w:r>
-        <w:t xml:space="preserve"> </w:t>
-      </w:r>
-      <w:r>
-        <w:t xml:space="preserve">ratio, is required to break the degeneracy. This requirement is analogous to adding an independent contrast dimension to separate two physical sources of signal, as in established multi-parameter imaging models [15]. In the pessimistic baseline model, the key separability handle is the composition dependence of</w:t>
-      </w:r>
-      <w:r>
-        <w:t xml:space="preserve"> </w:t>
-      </w:r>
-      <m:oMath>
-        <m:sSub>
-          <m:e>
-            <m:r>
-              <m:t>I</m:t>
-            </m:r>
-          </m:e>
-          <m:sub>
-            <m:r>
-              <m:t>3</m:t>
-            </m:r>
-          </m:sub>
-        </m:sSub>
-      </m:oMath>
-      <w:r>
-        <w:t xml:space="preserve">. Therefore, PLI oxygenation studies should report the lifetime together with</w:t>
-      </w:r>
-      <w:r>
-        <w:t xml:space="preserve"> </w:t>
-      </w:r>
-      <m:oMath>
-        <m:sSub>
-          <m:e>
-            <m:r>
-              <m:t>I</m:t>
-            </m:r>
-          </m:e>
-          <m:sub>
-            <m:r>
-              <m:t>3</m:t>
-            </m:r>
-          </m:sub>
-        </m:sSub>
-      </m:oMath>
-      <w:r>
-        <w:t xml:space="preserve"> </w:t>
-      </w:r>
-      <w:r>
-        <w:t xml:space="preserve">or</w:t>
-      </w:r>
-      <w:r>
-        <w:t xml:space="preserve"> </w:t>
-      </w:r>
-      <m:oMath>
-        <m:r>
-          <m:t>3</m:t>
-        </m:r>
-        <m:r>
-          <m:t>γ</m:t>
-        </m:r>
-        <m:r>
-          <m:rPr>
-            <m:sty m:val="p"/>
-          </m:rPr>
-          <m:t>/</m:t>
-        </m:r>
-        <m:r>
-          <m:t>2</m:t>
-        </m:r>
-        <m:r>
-          <m:t>γ</m:t>
-        </m:r>
-      </m:oMath>
-      <w:r>
-        <w:t xml:space="preserve">, and should treat co-registered CT/MRI-derived composition as a correction variable rather than a nuisance to ignore.</w:t>
-      </w:r>
-    </w:p>
-    <w:p>
-      <w:pPr>
-        <w:pStyle w:val="BodyText"/>
-      </w:pPr>
-      <w:r>
-        <w:t xml:space="preserve">However, identifiability in principle does not imply clinical feasibility. The CRLBs show that current count yields are far from sufficient for voxel-level pO</w:t>
-      </w:r>
-      <m:oMath>
-        <m:sSub>
-          <m:e>
-            <m:r>
-              <m:t>​</m:t>
-            </m:r>
-          </m:e>
-          <m:sub>
-            <m:r>
-              <m:t>2</m:t>
-            </m:r>
-          </m:sub>
-        </m:sSub>
-      </m:oMath>
-      <w:r>
-        <w:t xml:space="preserve"> </w:t>
-      </w:r>
-      <w:r>
-        <w:t xml:space="preserve">separation. The relevant design target is not merely estimating a single lifetime, for which photon-limited precision scaling is well established [16], but separating oxygenation from composition in a two-parameter model. Under the yield scenarios used here, that target requires regional pooling at volumes incompatible with focal tumour hypoxia imaging. This does not preclude regional or ex-vivo studies, nor future systems with substantially higher effective o-Ps yields, but it sets a quantitative bar for claims of voxel-scale hypoxia imaging.</w:t>
-      </w:r>
-    </w:p>
-    <w:p>
-      <w:pPr>
-        <w:pStyle w:val="BodyText"/>
-      </w:pPr>
-      <w:r>
-        <w:t xml:space="preserve">The decisive experiment is a controlled PALS matrix over O</w:t>
-      </w:r>
-      <m:oMath>
-        <m:sSub>
-          <m:e>
-            <m:r>
-              <m:t>​</m:t>
-            </m:r>
-          </m:e>
-          <m:sub>
-            <m:r>
-              <m:t>2</m:t>
-            </m:r>
-          </m:sub>
-        </m:sSub>
-      </m:oMath>
-      <w:r>
-        <w:t xml:space="preserve"> </w:t>
-      </w:r>
-      <w:r>
-        <w:t xml:space="preserve">by medium: water, lipid emulsion and protein/serum. Such an experiment should measure both</w:t>
-      </w:r>
-      <w:r>
-        <w:t xml:space="preserve"> </w:t>
-      </w:r>
-      <m:oMath>
-        <m:sSub>
-          <m:e>
-            <m:r>
-              <m:t>τ</m:t>
-            </m:r>
-          </m:e>
-          <m:sub>
-            <m:r>
-              <m:t>3</m:t>
-            </m:r>
-          </m:sub>
-        </m:sSub>
-      </m:oMath>
-      <w:r>
-        <w:t xml:space="preserve"> </w:t>
-      </w:r>
-      <w:r>
-        <w:t xml:space="preserve">and</w:t>
-      </w:r>
-      <w:r>
-        <w:t xml:space="preserve"> </w:t>
-      </w:r>
-      <m:oMath>
-        <m:sSub>
-          <m:e>
-            <m:r>
-              <m:t>I</m:t>
-            </m:r>
-          </m:e>
-          <m:sub>
-            <m:r>
-              <m:t>3</m:t>
-            </m:r>
-          </m:sub>
-        </m:sSub>
-      </m:oMath>
-      <w:r>
-        <w:t xml:space="preserve"> </w:t>
-      </w:r>
-      <w:r>
-        <w:t xml:space="preserve">under independently measured dissolved oxygen. It would determine</w:t>
+        <w:t xml:space="preserve">Because</w:t>
       </w:r>
       <w:r>
         <w:t xml:space="preserve"> </w:t>
@@ -3959,6 +4452,540 @@
         </m:sSub>
       </m:oMath>
       <w:r>
+        <w:t xml:space="preserve"> </w:t>
+      </w:r>
+      <w:r>
+        <w:t xml:space="preserve">is unmeasured, we also performed an intentionally high stress test above the conservative baseline sweep. Increasing</w:t>
+      </w:r>
+      <w:r>
+        <w:t xml:space="preserve"> </w:t>
+      </w:r>
+      <m:oMath>
+        <m:sSub>
+          <m:e>
+            <m:r>
+              <m:t>κ</m:t>
+            </m:r>
+          </m:e>
+          <m:sub>
+            <m:r>
+              <m:rPr>
+                <m:sty m:val="p"/>
+              </m:rPr>
+              <m:t>l</m:t>
+            </m:r>
+            <m:r>
+              <m:rPr>
+                <m:sty m:val="p"/>
+              </m:rPr>
+              <m:t>i</m:t>
+            </m:r>
+            <m:r>
+              <m:rPr>
+                <m:sty m:val="p"/>
+              </m:rPr>
+              <m:t>p</m:t>
+            </m:r>
+            <m:r>
+              <m:rPr>
+                <m:sty m:val="p"/>
+              </m:rPr>
+              <m:t>i</m:t>
+            </m:r>
+            <m:r>
+              <m:rPr>
+                <m:sty m:val="p"/>
+              </m:rPr>
+              <m:t>d</m:t>
+            </m:r>
+          </m:sub>
+        </m:sSub>
+      </m:oMath>
+      <w:r>
+        <w:t xml:space="preserve"> </w:t>
+      </w:r>
+      <w:r>
+        <w:t xml:space="preserve">markedly improved fatty-tissue feasibility, but did not remove the structural non-identifiability or make the lean-tissue tumour-hypoxia regime voxel-feasible. In the</w:t>
+      </w:r>
+      <w:r>
+        <w:t xml:space="preserve"> </w:t>
+      </w:r>
+      <m:oMath>
+        <m:sSup>
+          <m:e>
+            <m:r>
+              <m:t>​</m:t>
+            </m:r>
+          </m:e>
+          <m:sup>
+            <m:r>
+              <m:t>124</m:t>
+            </m:r>
+          </m:sup>
+        </m:sSup>
+      </m:oMath>
+      <w:r>
+        <w:t xml:space="preserve">I scenario, the required volume at</w:t>
+      </w:r>
+      <w:r>
+        <w:t xml:space="preserve"> </w:t>
+      </w:r>
+      <m:oMath>
+        <m:r>
+          <m:t>f</m:t>
+        </m:r>
+        <m:r>
+          <m:rPr>
+            <m:sty m:val="p"/>
+          </m:rPr>
+          <m:t>=</m:t>
+        </m:r>
+        <m:r>
+          <m:t>0.60</m:t>
+        </m:r>
+      </m:oMath>
+      <w:r>
+        <w:t xml:space="preserve"> </w:t>
+      </w:r>
+      <w:r>
+        <w:t xml:space="preserve">and pO</w:t>
+      </w:r>
+      <m:oMath>
+        <m:sSub>
+          <m:e>
+            <m:r>
+              <m:t>​</m:t>
+            </m:r>
+          </m:e>
+          <m:sub>
+            <m:r>
+              <m:t>2</m:t>
+            </m:r>
+          </m:sub>
+        </m:sSub>
+      </m:oMath>
+      <w:r>
+        <w:t xml:space="preserve"> </w:t>
+      </w:r>
+      <w:r>
+        <w:t xml:space="preserve">= 10 mmHg fell from 5.1 L at the central 0.3</w:t>
+      </w:r>
+      <m:oMath>
+        <m:r>
+          <m:rPr>
+            <m:sty m:val="p"/>
+          </m:rPr>
+          <m:t>×</m:t>
+        </m:r>
+      </m:oMath>
+      <w:r>
+        <w:t xml:space="preserve"> </w:t>
+      </w:r>
+      <w:r>
+        <w:t xml:space="preserve">assumption to 98 mL at 3</w:t>
+      </w:r>
+      <m:oMath>
+        <m:r>
+          <m:rPr>
+            <m:sty m:val="p"/>
+          </m:rPr>
+          <m:t>×</m:t>
+        </m:r>
+      </m:oMath>
+      <w:r>
+        <w:t xml:space="preserve"> </w:t>
+      </w:r>
+      <w:r>
+        <w:t xml:space="preserve">and 9.5 mL at a 10</w:t>
+      </w:r>
+      <m:oMath>
+        <m:r>
+          <m:rPr>
+            <m:sty m:val="p"/>
+          </m:rPr>
+          <m:t>×</m:t>
+        </m:r>
+      </m:oMath>
+      <w:r>
+        <w:t xml:space="preserve"> </w:t>
+      </w:r>
+      <w:r>
+        <w:t xml:space="preserve">organic-liquid stress test. At</w:t>
+      </w:r>
+      <w:r>
+        <w:t xml:space="preserve"> </w:t>
+      </w:r>
+      <m:oMath>
+        <m:r>
+          <m:t>f</m:t>
+        </m:r>
+        <m:r>
+          <m:rPr>
+            <m:sty m:val="p"/>
+          </m:rPr>
+          <m:t>=</m:t>
+        </m:r>
+        <m:r>
+          <m:t>0.05</m:t>
+        </m:r>
+      </m:oMath>
+      <w:r>
+        <w:t xml:space="preserve">, however, the same stress test still required litre-scale pooling: 19.6 L, 7.1 L and 1.7 L at 0.3</w:t>
+      </w:r>
+      <m:oMath>
+        <m:r>
+          <m:rPr>
+            <m:sty m:val="p"/>
+          </m:rPr>
+          <m:t>×</m:t>
+        </m:r>
+      </m:oMath>
+      <w:r>
+        <w:t xml:space="preserve">, 3</w:t>
+      </w:r>
+      <m:oMath>
+        <m:r>
+          <m:rPr>
+            <m:sty m:val="p"/>
+          </m:rPr>
+          <m:t>×</m:t>
+        </m:r>
+      </m:oMath>
+      <w:r>
+        <w:t xml:space="preserve"> </w:t>
+      </w:r>
+      <w:r>
+        <w:t xml:space="preserve">and 10</w:t>
+      </w:r>
+      <m:oMath>
+        <m:r>
+          <m:rPr>
+            <m:sty m:val="p"/>
+          </m:rPr>
+          <m:t>×</m:t>
+        </m:r>
+      </m:oMath>
+      <w:r>
+        <w:t xml:space="preserve">, respectively (Table 4). Thus a small fatty ROI could become conceivable under an optimistic organic-liquid-like quenching stress test, but lean tumour-hypoxia tissue remains litre-scale and the native-voxel conclusion and need for a second observable are unchanged.</w:t>
+      </w:r>
+    </w:p>
+    <w:bookmarkEnd w:id="20"/>
+    <w:bookmarkEnd w:id="21"/>
+    <w:bookmarkStart w:id="22" w:name="discussion"/>
+    <w:p>
+      <w:pPr>
+        <w:pStyle w:val="Heading2"/>
+      </w:pPr>
+      <w:r>
+        <w:t xml:space="preserve">Discussion</w:t>
+      </w:r>
+    </w:p>
+    <w:p>
+      <w:pPr>
+        <w:pStyle w:val="FirstParagraph"/>
+      </w:pPr>
+      <w:r>
+        <w:t xml:space="preserve">This analysis identifies a fundamental limitation for positronium-lifetime hypoxia imaging. Oxygen quenching of o-Ps is real, but a lifetime map is not an oxygenation map unless composition is controlled. From</w:t>
+      </w:r>
+      <w:r>
+        <w:t xml:space="preserve"> </w:t>
+      </w:r>
+      <m:oMath>
+        <m:sSub>
+          <m:e>
+            <m:r>
+              <m:t>τ</m:t>
+            </m:r>
+          </m:e>
+          <m:sub>
+            <m:r>
+              <m:t>3</m:t>
+            </m:r>
+          </m:sub>
+        </m:sSub>
+      </m:oMath>
+      <w:r>
+        <w:t xml:space="preserve"> </w:t>
+      </w:r>
+      <w:r>
+        <w:t xml:space="preserve">alone, oxygenation and composition collapse into a single measured decay rate, making the inverse problem structurally non-identifiable even with arbitrarily many counts. The practical consequence is large apparent-pO</w:t>
+      </w:r>
+      <m:oMath>
+        <m:sSub>
+          <m:e>
+            <m:r>
+              <m:t>​</m:t>
+            </m:r>
+          </m:e>
+          <m:sub>
+            <m:r>
+              <m:t>2</m:t>
+            </m:r>
+          </m:sub>
+        </m:sSub>
+      </m:oMath>
+      <w:r>
+        <w:t xml:space="preserve"> </w:t>
+      </w:r>
+      <w:r>
+        <w:t xml:space="preserve">bias when composition is ignored.</w:t>
+      </w:r>
+    </w:p>
+    <w:p>
+      <w:pPr>
+        <w:pStyle w:val="BodyText"/>
+      </w:pPr>
+      <w:r>
+        <w:t xml:space="preserve">The analysis is also constructive. It shows that a second observable, such as o-Ps intensity</w:t>
+      </w:r>
+      <w:r>
+        <w:t xml:space="preserve"> </w:t>
+      </w:r>
+      <m:oMath>
+        <m:sSub>
+          <m:e>
+            <m:r>
+              <m:t>I</m:t>
+            </m:r>
+          </m:e>
+          <m:sub>
+            <m:r>
+              <m:t>3</m:t>
+            </m:r>
+          </m:sub>
+        </m:sSub>
+      </m:oMath>
+      <w:r>
+        <w:t xml:space="preserve"> </w:t>
+      </w:r>
+      <w:r>
+        <w:t xml:space="preserve">or a related 3</w:t>
+      </w:r>
+      <m:oMath>
+        <m:r>
+          <m:t>γ</m:t>
+        </m:r>
+      </m:oMath>
+      <w:r>
+        <w:t xml:space="preserve">/2</w:t>
+      </w:r>
+      <m:oMath>
+        <m:r>
+          <m:t>γ</m:t>
+        </m:r>
+      </m:oMath>
+      <w:r>
+        <w:t xml:space="preserve"> </w:t>
+      </w:r>
+      <w:r>
+        <w:t xml:space="preserve">ratio, is required to break the degeneracy. This is the o-Ps analogue of adding a second echo to make fat/water separation full-rank: one contrast dimension is not enough when two physical sources move the signal. In the pessimistic baseline model, the key separability handle is the composition dependence of</w:t>
+      </w:r>
+      <w:r>
+        <w:t xml:space="preserve"> </w:t>
+      </w:r>
+      <m:oMath>
+        <m:sSub>
+          <m:e>
+            <m:r>
+              <m:t>I</m:t>
+            </m:r>
+          </m:e>
+          <m:sub>
+            <m:r>
+              <m:t>3</m:t>
+            </m:r>
+          </m:sub>
+        </m:sSub>
+      </m:oMath>
+      <w:r>
+        <w:t xml:space="preserve">. Therefore, PLI oxygenation studies should report the lifetime together with</w:t>
+      </w:r>
+      <w:r>
+        <w:t xml:space="preserve"> </w:t>
+      </w:r>
+      <m:oMath>
+        <m:sSub>
+          <m:e>
+            <m:r>
+              <m:t>I</m:t>
+            </m:r>
+          </m:e>
+          <m:sub>
+            <m:r>
+              <m:t>3</m:t>
+            </m:r>
+          </m:sub>
+        </m:sSub>
+      </m:oMath>
+      <w:r>
+        <w:t xml:space="preserve"> </w:t>
+      </w:r>
+      <w:r>
+        <w:t xml:space="preserve">or 3</w:t>
+      </w:r>
+      <m:oMath>
+        <m:r>
+          <m:t>γ</m:t>
+        </m:r>
+      </m:oMath>
+      <w:r>
+        <w:t xml:space="preserve">/2</w:t>
+      </w:r>
+      <m:oMath>
+        <m:r>
+          <m:t>γ</m:t>
+        </m:r>
+      </m:oMath>
+      <w:r>
+        <w:t xml:space="preserve">, and should treat co-registered CT/MRI-derived composition as a correction variable rather than a nuisance to ignore.</w:t>
+      </w:r>
+    </w:p>
+    <w:p>
+      <w:pPr>
+        <w:pStyle w:val="BodyText"/>
+      </w:pPr>
+      <w:r>
+        <w:t xml:space="preserve">However, identifiability in principle does not imply clinical feasibility. The CRLBs show that current count yields are far from sufficient for voxel-level pO</w:t>
+      </w:r>
+      <m:oMath>
+        <m:sSub>
+          <m:e>
+            <m:r>
+              <m:t>​</m:t>
+            </m:r>
+          </m:e>
+          <m:sub>
+            <m:r>
+              <m:t>2</m:t>
+            </m:r>
+          </m:sub>
+        </m:sSub>
+      </m:oMath>
+      <w:r>
+        <w:t xml:space="preserve"> </w:t>
+      </w:r>
+      <w:r>
+        <w:t xml:space="preserve">separation. The relevant design target is not merely estimating a single lifetime, for which photon-limited precision scaling is well established [8, 9], but separating oxygenation from composition in a two-parameter model. Under the yield scenarios used here, separation is out of reach at native voxel resolution by approximately five to six orders of magnitude. The smaller three-to-four-order gap applies only after pooling to millilitre-scale regions. This does not preclude regional, ex-vivo or future high-yield studies, but it sets a quantitative bar for claims of voxel-scale hypoxia imaging.</w:t>
+      </w:r>
+    </w:p>
+    <w:p>
+      <w:pPr>
+        <w:pStyle w:val="BodyText"/>
+      </w:pPr>
+      <w:r>
+        <w:t xml:space="preserve">The decisive experiment is a controlled PALS matrix over O</w:t>
+      </w:r>
+      <m:oMath>
+        <m:sSub>
+          <m:e>
+            <m:r>
+              <m:t>​</m:t>
+            </m:r>
+          </m:e>
+          <m:sub>
+            <m:r>
+              <m:t>2</m:t>
+            </m:r>
+          </m:sub>
+        </m:sSub>
+      </m:oMath>
+      <w:r>
+        <w:t xml:space="preserve"> </w:t>
+      </w:r>
+      <w:r>
+        <w:t xml:space="preserve">by medium: water, lipid emulsion and protein/serum. Such an experiment should measure both</w:t>
+      </w:r>
+      <w:r>
+        <w:t xml:space="preserve"> </w:t>
+      </w:r>
+      <m:oMath>
+        <m:sSub>
+          <m:e>
+            <m:r>
+              <m:t>τ</m:t>
+            </m:r>
+          </m:e>
+          <m:sub>
+            <m:r>
+              <m:t>3</m:t>
+            </m:r>
+          </m:sub>
+        </m:sSub>
+      </m:oMath>
+      <w:r>
+        <w:t xml:space="preserve"> </w:t>
+      </w:r>
+      <w:r>
+        <w:t xml:space="preserve">and</w:t>
+      </w:r>
+      <w:r>
+        <w:t xml:space="preserve"> </w:t>
+      </w:r>
+      <m:oMath>
+        <m:sSub>
+          <m:e>
+            <m:r>
+              <m:t>I</m:t>
+            </m:r>
+          </m:e>
+          <m:sub>
+            <m:r>
+              <m:t>3</m:t>
+            </m:r>
+          </m:sub>
+        </m:sSub>
+      </m:oMath>
+      <w:r>
+        <w:t xml:space="preserve"> </w:t>
+      </w:r>
+      <w:r>
+        <w:t xml:space="preserve">under independently measured dissolved oxygen. It would determine</w:t>
+      </w:r>
+      <w:r>
+        <w:t xml:space="preserve"> </w:t>
+      </w:r>
+      <m:oMath>
+        <m:sSub>
+          <m:e>
+            <m:r>
+              <m:t>κ</m:t>
+            </m:r>
+          </m:e>
+          <m:sub>
+            <m:r>
+              <m:rPr>
+                <m:sty m:val="p"/>
+              </m:rPr>
+              <m:t>l</m:t>
+            </m:r>
+            <m:r>
+              <m:rPr>
+                <m:sty m:val="p"/>
+              </m:rPr>
+              <m:t>i</m:t>
+            </m:r>
+            <m:r>
+              <m:rPr>
+                <m:sty m:val="p"/>
+              </m:rPr>
+              <m:t>p</m:t>
+            </m:r>
+            <m:r>
+              <m:rPr>
+                <m:sty m:val="p"/>
+              </m:rPr>
+              <m:t>i</m:t>
+            </m:r>
+            <m:r>
+              <m:rPr>
+                <m:sty m:val="p"/>
+              </m:rPr>
+              <m:t>d</m:t>
+            </m:r>
+          </m:sub>
+        </m:sSub>
+      </m:oMath>
+      <w:r>
         <w:t xml:space="preserve">, protein-environment quenching,</w:t>
       </w:r>
       <w:r>
@@ -4087,7 +5114,7 @@
         <w:t xml:space="preserve"> </w:t>
       </w:r>
       <w:r>
-        <w:t xml:space="preserve">values are illustrative placeholders, and the composition slope is assumed non-zero in the baseline scenario. The lipid quenching constant is unmeasured in relevant biological environments and was therefore swept. The count model is anchored to one public preprint yield and uses scenario-level isotope factors rather than scanner-specific measured yields. Nuisance profiling provides a more conservative CRLB, but the spectrum model remains idealised. Finally, the Monte Carlo validates statistical attainability under the assumed spectrum model, not the biological forward model. A PALS measurement or re-analysis of real data with</w:t>
+        <w:t xml:space="preserve">values are illustrative placeholders, and the composition slope is assumed non-zero in the baseline scenario. The lipid quenching constant is unmeasured in relevant biological environments and was therefore swept. The count model is anchored to one public preprint yield and uses scenario-level isotope factors rather than scanner-specific measured yields. Nuisance profiling provides a more conservative CRLB, but the spectrum model remains idealised. In particular,</w:t>
       </w:r>
       <w:r>
         <w:t xml:space="preserve"> </w:t>
@@ -4110,6 +5137,52 @@
         <w:t xml:space="preserve"> </w:t>
       </w:r>
       <w:r>
+        <w:t xml:space="preserve">in the model is the intrinsic o-Ps formation probability, whereas a scanner estimates a fitted o-Ps amplitude that also absorbs detection efficiency, scatter, attenuation, geometric acceptance, accidental background and prompt-gamma contamination. The FIM profiles per-spectrum nuisances, but not this full imaging chain; the realistic</w:t>
+      </w:r>
+      <w:r>
+        <w:t xml:space="preserve"> </w:t>
+      </w:r>
+      <m:oMath>
+        <m:sSub>
+          <m:e>
+            <m:r>
+              <m:t>I</m:t>
+            </m:r>
+          </m:e>
+          <m:sub>
+            <m:r>
+              <m:t>3</m:t>
+            </m:r>
+          </m:sub>
+        </m:sSub>
+      </m:oMath>
+      <w:r>
+        <w:t xml:space="preserve"> </w:t>
+      </w:r>
+      <w:r>
+        <w:t xml:space="preserve">covariance and the corresponding CRLB are therefore likely lower bounds on the in-system problem. Finally, the Monte Carlo validates statistical attainability under the assumed spectrum model, not the biological forward model. A PALS measurement or re-analysis of real data with</w:t>
+      </w:r>
+      <w:r>
+        <w:t xml:space="preserve"> </w:t>
+      </w:r>
+      <m:oMath>
+        <m:sSub>
+          <m:e>
+            <m:r>
+              <m:t>I</m:t>
+            </m:r>
+          </m:e>
+          <m:sub>
+            <m:r>
+              <m:t>3</m:t>
+            </m:r>
+          </m:sub>
+        </m:sSub>
+      </m:oMath>
+      <w:r>
+        <w:t xml:space="preserve"> </w:t>
+      </w:r>
+      <w:r>
         <w:t xml:space="preserve">extraction remains the key empirical anchor.</w:t>
       </w:r>
     </w:p>
@@ -4118,7 +5191,54 @@
         <w:pStyle w:val="BodyText"/>
       </w:pPr>
       <w:r>
-        <w:t xml:space="preserve">In summary, positronium-lifetime hypoxia imaging is limited by an oxygenation-versus-composition identifiability problem. Lifetime-only PLI contrasts should not be interpreted as hypoxia without composition control. A second observable can make the problem identifiable, but current count yields imply that clinically useful voxel-scale separation is not achievable without major gains in effective o-Ps statistics or strong external composition constraints.</w:t>
+        <w:t xml:space="preserve">In summary, positronium-lifetime hypoxia imaging is limited by an oxygenation-versus-composition identifiability problem. Lifetime-only PLI contrasts should not be interpreted as hypoxia without composition control. A second observable can make the problem identifiable, but current count yields imply that clinically useful voxel-scale separation is not achievable without major gains in effective o-Ps statistics or strong external composition constraints. Highly fatty tissue may be less prohibitive under an optimistic high-</w:t>
+      </w:r>
+      <m:oMath>
+        <m:sSub>
+          <m:e>
+            <m:r>
+              <m:t>κ</m:t>
+            </m:r>
+          </m:e>
+          <m:sub>
+            <m:r>
+              <m:rPr>
+                <m:sty m:val="p"/>
+              </m:rPr>
+              <m:t>l</m:t>
+            </m:r>
+            <m:r>
+              <m:rPr>
+                <m:sty m:val="p"/>
+              </m:rPr>
+              <m:t>i</m:t>
+            </m:r>
+            <m:r>
+              <m:rPr>
+                <m:sty m:val="p"/>
+              </m:rPr>
+              <m:t>p</m:t>
+            </m:r>
+            <m:r>
+              <m:rPr>
+                <m:sty m:val="p"/>
+              </m:rPr>
+              <m:t>i</m:t>
+            </m:r>
+            <m:r>
+              <m:rPr>
+                <m:sty m:val="p"/>
+              </m:rPr>
+              <m:t>d</m:t>
+            </m:r>
+          </m:sub>
+        </m:sSub>
+      </m:oMath>
+      <w:r>
+        <w:t xml:space="preserve"> </w:t>
+      </w:r>
+      <w:r>
+        <w:t xml:space="preserve">stress test, but that does not rescue the lean tumour-hypoxia regime targeted by voxel-scale hypoxia imaging claims.</w:t>
       </w:r>
     </w:p>
     <w:bookmarkEnd w:id="22"/>
@@ -4224,7 +5344,7 @@
         </w:numPr>
       </w:pPr>
       <w:r>
-        <w:t xml:space="preserve">Alkhorayef MA, Abuelhia EI, Chin MPW, Spyrou NM. Determination of the relative oxygenation of samples by ortho-positronium 3-gamma decay for future application in oncology. J Radioanal Nucl Chem. 2009;281:171-174. https://doi.org/10.1007/s10967-009-0123-6</w:t>
+        <w:t xml:space="preserve">Berens L, Hsu I, Chen CT, Halpern H, Kao CM. An analytic, moment-based method to estimate orthopositronium lifetimes in positron annihilation lifetime spectroscopy measurements. Bio-Algorithms Med-Syst. 2024;20(Spec. Issue):40-48. https://doi.org/10.5604/01.3001.0054.9141</w:t>
       </w:r>
     </w:p>
     <w:p>
@@ -4236,7 +5356,7 @@
         </w:numPr>
       </w:pPr>
       <w:r>
-        <w:t xml:space="preserve">Alkhorayef M, Sulieman A, Alsager OA, Alrumayan F, Alkhomashi N. Investigation of using positronium and its annihilation for hypoxia PET imaging. Radiat Phys Chem. 2021;188:109690. https://doi.org/10.1016/j.radphyschem.2021.109690</w:t>
+        <w:t xml:space="preserve">Köllner M, Wolfrum J. How many photons are necessary for fluorescence-lifetime measurements? Chem Phys Lett. 1992;200:199-204. https://doi.org/10.1016/0009-2614(92)87068-Z</w:t>
       </w:r>
     </w:p>
     <w:p>
@@ -4248,35 +5368,7 @@
         </w:numPr>
       </w:pPr>
       <w:r>
-        <w:t xml:space="preserve">Moskal P. Quantum entanglement degree, mean positronium lifetime, and the</w:t>
-      </w:r>
-      <w:r>
-        <w:t xml:space="preserve"> </w:t>
-      </w:r>
-      <m:oMath>
-        <m:r>
-          <m:t>3</m:t>
-        </m:r>
-        <m:r>
-          <m:t>γ</m:t>
-        </m:r>
-      </m:oMath>
-      <w:r>
-        <w:t xml:space="preserve">/</w:t>
-      </w:r>
-      <m:oMath>
-        <m:r>
-          <m:t>2</m:t>
-        </m:r>
-        <m:r>
-          <m:t>γ</m:t>
-        </m:r>
-      </m:oMath>
-      <w:r>
-        <w:t xml:space="preserve"> </w:t>
-      </w:r>
-      <w:r>
-        <w:t xml:space="preserve">annihilation-rate ratio as novel PET biomarkers for hypoxia: concept, challenges, and predictions. Bio-Algorithms Med-Syst. 2026;22:56. https://doi.org/10.5604/01.3001.0055.7461</w:t>
+        <w:t xml:space="preserve">Alkhorayef MA, Abuelhia EI, Chin MPW, Spyrou NM. Determination of the relative oxygenation of samples by ortho-positronium 3-gamma decay for future application in oncology. J Radioanal Nucl Chem. 2009;281:171-174. https://doi.org/10.1007/s10967-009-0123-6</w:t>
       </w:r>
     </w:p>
     <w:p>
@@ -4288,7 +5380,7 @@
         </w:numPr>
       </w:pPr>
       <w:r>
-        <w:t xml:space="preserve">Zermeño ED. Cardiac positronium lifetime in human PET: a reproducible right-left ventricular contrast that is not explained by blood oxygenation. medRxiv. 2026. https://doi.org/10.64898/2026.06.14.26355630</w:t>
+        <w:t xml:space="preserve">Alkhorayef M, Sulieman A, Alsager OA, Alrumayan F, Alkhomashi N. Investigation of using positronium and its annihilation for hypoxia PET imaging. Radiat Phys Chem. 2021;188:109690. https://doi.org/10.1016/j.radphyschem.2021.109690</w:t>
       </w:r>
     </w:p>
     <w:p>
@@ -4300,7 +5392,35 @@
         </w:numPr>
       </w:pPr>
       <w:r>
-        <w:t xml:space="preserve">Battino R, Evans FD, Danforth WF. The solubilities of seven gases in olive oil. J Am Oil Chem Soc. 1968;45:830. https://doi.org/10.1007/BF02540163</w:t>
+        <w:t xml:space="preserve">Moskal P. Quantum entanglement degree, mean positronium lifetime, and the</w:t>
+      </w:r>
+      <w:r>
+        <w:t xml:space="preserve"> </w:t>
+      </w:r>
+      <m:oMath>
+        <m:r>
+          <m:t>3</m:t>
+        </m:r>
+        <m:r>
+          <m:t>γ</m:t>
+        </m:r>
+      </m:oMath>
+      <w:r>
+        <w:t xml:space="preserve">/</w:t>
+      </w:r>
+      <m:oMath>
+        <m:r>
+          <m:t>2</m:t>
+        </m:r>
+        <m:r>
+          <m:t>γ</m:t>
+        </m:r>
+      </m:oMath>
+      <w:r>
+        <w:t xml:space="preserve"> </w:t>
+      </w:r>
+      <w:r>
+        <w:t xml:space="preserve">annihilation-rate ratio as novel PET biomarkers for hypoxia: concept, challenges, and predictions. Bio-Algorithms Med-Syst. 2026;22:56. https://doi.org/10.5604/01.3001.0055.7461</w:t>
       </w:r>
     </w:p>
     <w:p>
@@ -4312,7 +5432,7 @@
         </w:numPr>
       </w:pPr>
       <w:r>
-        <w:t xml:space="preserve">Roppongi T, Mizuno N, Miyagawa Y, Kobayashi T, Nakagawa K, Adachi S. Solubility and mass transfer coefficient of oxygen through gas- and water-lipid interfaces. J Food Sci. 2021;86:867-873. https://doi.org/10.1111/1750-3841.15641</w:t>
+        <w:t xml:space="preserve">Zermeño ED. Cardiac positronium lifetime in human PET: a reproducible right-left ventricular contrast that is not explained by blood oxygenation. medRxiv. 2026. https://doi.org/10.64898/2026.06.14.26355630</w:t>
       </w:r>
     </w:p>
     <w:p>
@@ -4324,7 +5444,7 @@
         </w:numPr>
       </w:pPr>
       <w:r>
-        <w:t xml:space="preserve">Mercolli L, Steinberger WM, Grundler PV, et al. First positronium lifetime imaging with scandium-44 on a long axial field-of-view PET/CT. arXiv. 2025. https://arxiv.org/abs/2506.13460</w:t>
+        <w:t xml:space="preserve">Steinberger WM, Mercolli L, Breuer J, et al. Positronium lifetime validation measurements using a long-axial field-of-view positron emission tomography scanner. EJNMMI Phys. 2024;11:76. https://doi.org/10.1186/s40658-024-00678-4</w:t>
       </w:r>
     </w:p>
     <w:p>
@@ -4336,7 +5456,27 @@
         </w:numPr>
       </w:pPr>
       <w:r>
-        <w:t xml:space="preserve">Sourbron SP, Buckley DL. Classic models for dynamic contrast-enhanced MRI. NMR Biomed. 2013;26:1004-1027. https://doi.org/10.1002/nbm.2940</w:t>
+        <w:t xml:space="preserve">Mercolli L, Steinberger WM, Rathod N, et al. Positronium lifetime imaging with the Biograph Vision Quadra using</w:t>
+      </w:r>
+      <w:r>
+        <w:t xml:space="preserve"> </w:t>
+      </w:r>
+      <m:oMath>
+        <m:sSup>
+          <m:e>
+            <m:r>
+              <m:t>​</m:t>
+            </m:r>
+          </m:e>
+          <m:sup>
+            <m:r>
+              <m:t>124</m:t>
+            </m:r>
+          </m:sup>
+        </m:sSup>
+      </m:oMath>
+      <w:r>
+        <w:t xml:space="preserve">I. arXiv. 2025. https://doi.org/10.48550/arXiv.2501.04145</w:t>
       </w:r>
     </w:p>
     <w:p>
@@ -4348,7 +5488,43 @@
         </w:numPr>
       </w:pPr>
       <w:r>
-        <w:t xml:space="preserve">Köllner M, Wolfrum J. How many photons are necessary for fluorescence-lifetime measurements? Chem Phys Lett. 1992;200:199-204. https://doi.org/10.1016/0009-2614(92)87068-Z</w:t>
+        <w:t xml:space="preserve">Battino R, Evans FD, Danforth WF. The solubilities of seven gases in olive oil. J Am Oil Chem Soc. 1968;45:830. https://doi.org/10.1007/BF02540163</w:t>
+      </w:r>
+    </w:p>
+    <w:p>
+      <w:pPr>
+        <w:pStyle w:val="Compact"/>
+        <w:numPr>
+          <w:ilvl w:val="0"/>
+          <w:numId w:val="1002"/>
+        </w:numPr>
+      </w:pPr>
+      <w:r>
+        <w:t xml:space="preserve">Roppongi T, Mizuno N, Miyagawa Y, Kobayashi T, Nakagawa K, Adachi S. Solubility and mass transfer coefficient of oxygen through gas- and water-lipid interfaces. J Food Sci. 2021;86:867-873. https://doi.org/10.1111/1750-3841.15641</w:t>
+      </w:r>
+    </w:p>
+    <w:p>
+      <w:pPr>
+        <w:pStyle w:val="Compact"/>
+        <w:numPr>
+          <w:ilvl w:val="0"/>
+          <w:numId w:val="1002"/>
+        </w:numPr>
+      </w:pPr>
+      <w:r>
+        <w:t xml:space="preserve">Mercolli L, Steinberger WM, Grundler PV, et al. First positronium lifetime imaging with scandium-44 on a long axial field-of-view PET/CT. arXiv. 2025. https://arxiv.org/abs/2506.13460</w:t>
+      </w:r>
+    </w:p>
+    <w:p>
+      <w:pPr>
+        <w:pStyle w:val="Compact"/>
+        <w:numPr>
+          <w:ilvl w:val="0"/>
+          <w:numId w:val="1002"/>
+        </w:numPr>
+      </w:pPr>
+      <w:r>
+        <w:t xml:space="preserve">Sourbron SP, Buckley DL. Classic models for dynamic contrast-enhanced MRI. NMR Biomed. 2013;26:1004-1027. https://doi.org/10.1002/nbm.2940</w:t>
       </w:r>
     </w:p>
     <w:bookmarkEnd w:id="23"/>
@@ -4660,7 +5836,7 @@
               <w:pStyle w:val="Compact"/>
             </w:pPr>
             <w:r>
-              <w:t xml:space="preserve">measured</w:t>
+              <w:t xml:space="preserve">operational water reference</w:t>
             </w:r>
           </w:p>
         </w:tc>
@@ -4671,7 +5847,7 @@
               <w:pStyle w:val="Compact"/>
             </w:pPr>
             <w:r>
-              <w:t xml:space="preserve">[1]</w:t>
+              <w:t xml:space="preserve">[14, 15]</w:t>
             </w:r>
           </w:p>
         </w:tc>
@@ -4934,7 +6110,7 @@
               <w:pStyle w:val="Compact"/>
             </w:pPr>
             <w:r>
-              <w:t xml:space="preserve">[12, 13]</w:t>
+              <w:t xml:space="preserve">[16, 17]</w:t>
             </w:r>
           </w:p>
         </w:tc>
@@ -5042,7 +6218,7 @@
               <w:pStyle w:val="Compact"/>
             </w:pPr>
             <w:r>
-              <w:t xml:space="preserve">unmeasured; swept 0.1-1.0 times water</w:t>
+              <w:t xml:space="preserve">unmeasured; conservative baseline sweep 0.1-1.0 times water</w:t>
             </w:r>
           </w:p>
         </w:tc>
@@ -5163,7 +6339,7 @@
         <w:t xml:space="preserve"> </w:t>
       </w:r>
       <w:r>
-        <w:t xml:space="preserve">Cramér-Rao bound on pO</w:t>
+        <w:t xml:space="preserve">Dependence of the pO</w:t>
       </w:r>
       <m:oMath>
         <m:sSub>
@@ -5175,6 +6351,29 @@
           <m:sub>
             <m:r>
               <m:t>2</m:t>
+            </m:r>
+          </m:sub>
+        </m:sSub>
+      </m:oMath>
+      <w:r>
+        <w:t xml:space="preserve"> </w:t>
+      </w:r>
+      <w:r>
+        <w:t xml:space="preserve">CRLB on the composition sensitivity of</w:t>
+      </w:r>
+      <w:r>
+        <w:t xml:space="preserve"> </w:t>
+      </w:r>
+      <m:oMath>
+        <m:sSub>
+          <m:e>
+            <m:r>
+              <m:t>I</m:t>
+            </m:r>
+          </m:e>
+          <m:sub>
+            <m:r>
+              <m:t>3</m:t>
             </m:r>
           </m:sub>
         </m:sSub>
@@ -5240,20 +6439,389 @@
         <w:t xml:space="preserve"> </w:t>
       </w:r>
       <w:r>
-        <w:t xml:space="preserve">o-Ps counts</w:t>
+        <w:t xml:space="preserve">o-Ps counts in the fixed-nuisance Poisson-spectrum model.</w:t>
+      </w:r>
+      <w:r>
+        <w:t xml:space="preserve"> </w:t>
+      </w:r>
+      <m:oMath>
+        <m:sSub>
+          <m:e>
+            <m:r>
+              <m:t>I</m:t>
+            </m:r>
+          </m:e>
+          <m:sub>
+            <m:r>
+              <m:t>3</m:t>
+            </m:r>
+          </m:sub>
+        </m:sSub>
+      </m:oMath>
+      <w:r>
+        <w:t xml:space="preserve"> </w:t>
+      </w:r>
+      <w:r>
+        <w:t xml:space="preserve">is a dimensionless formation-probability fraction with</w:t>
+      </w:r>
+      <w:r>
+        <w:t xml:space="preserve"> </w:t>
+      </w:r>
+      <m:oMath>
+        <m:sSub>
+          <m:e>
+            <m:r>
+              <m:t>I</m:t>
+            </m:r>
+          </m:e>
+          <m:sub>
+            <m:r>
+              <m:t>3</m:t>
+            </m:r>
+            <m:r>
+              <m:rPr>
+                <m:sty m:val="p"/>
+              </m:rPr>
+              <m:t>,</m:t>
+            </m:r>
+            <m:r>
+              <m:t>w</m:t>
+            </m:r>
+          </m:sub>
+        </m:sSub>
+        <m:r>
+          <m:rPr>
+            <m:sty m:val="p"/>
+          </m:rPr>
+          <m:t>=</m:t>
+        </m:r>
+        <m:r>
+          <m:t>0.15</m:t>
+        </m:r>
+      </m:oMath>
+      <w:r>
+        <w:t xml:space="preserve"> </w:t>
+      </w:r>
+      <w:r>
+        <w:t xml:space="preserve">in the nominal placeholder model.</w:t>
       </w:r>
     </w:p>
     <w:tbl>
       <w:tblPr>
         <w:tblStyle w:val="Table"/>
-        <w:tblW w:type="pct" w:w="5000"/>
-        <w:tblLayout w:type="fixed"/>
+        <w:tblW w:type="auto" w:w="0"/>
         <w:tblLook w:firstRow="1" w:lastRow="0" w:firstColumn="0" w:lastColumn="0" w:noHBand="0" w:noVBand="0" w:val="0020"/>
       </w:tblPr>
       <w:tblGrid>
-        <w:gridCol w:w="2160"/>
-        <w:gridCol w:w="2880"/>
-        <w:gridCol w:w="2880"/>
+        <w:gridCol w:w="3960"/>
+        <w:gridCol w:w="3960"/>
+      </w:tblGrid>
+      <w:tr>
+        <w:trPr>
+          <w:tblHeader w:val="on"/>
+        </w:trPr>
+        <w:tc>
+          <w:tcPr/>
+          <w:p>
+            <w:pPr>
+              <w:pStyle w:val="Compact"/>
+              <w:jc w:val="right"/>
+            </w:pPr>
+            <m:oMath>
+              <m:r>
+                <m:rPr>
+                  <m:sty m:val="p"/>
+                </m:rPr>
+                <m:t>∂</m:t>
+              </m:r>
+              <m:sSub>
+                <m:e>
+                  <m:r>
+                    <m:t>I</m:t>
+                  </m:r>
+                </m:e>
+                <m:sub>
+                  <m:r>
+                    <m:t>3</m:t>
+                  </m:r>
+                </m:sub>
+              </m:sSub>
+              <m:r>
+                <m:rPr>
+                  <m:sty m:val="p"/>
+                </m:rPr>
+                <m:t>/</m:t>
+              </m:r>
+              <m:r>
+                <m:rPr>
+                  <m:sty m:val="p"/>
+                </m:rPr>
+                <m:t>∂</m:t>
+              </m:r>
+              <m:r>
+                <m:t>f</m:t>
+              </m:r>
+            </m:oMath>
+          </w:p>
+        </w:tc>
+        <w:tc>
+          <w:tcPr/>
+          <w:p>
+            <w:pPr>
+              <w:pStyle w:val="Compact"/>
+              <w:jc w:val="right"/>
+            </w:pPr>
+            <m:oMath>
+              <m:r>
+                <m:t>σ</m:t>
+              </m:r>
+              <m:r>
+                <m:rPr>
+                  <m:sty m:val="p"/>
+                </m:rPr>
+                <m:t>(</m:t>
+              </m:r>
+              <m:r>
+                <m:t>p</m:t>
+              </m:r>
+              <m:sSub>
+                <m:e>
+                  <m:r>
+                    <m:t>O</m:t>
+                  </m:r>
+                </m:e>
+                <m:sub>
+                  <m:r>
+                    <m:t>2</m:t>
+                  </m:r>
+                </m:sub>
+              </m:sSub>
+              <m:r>
+                <m:rPr>
+                  <m:sty m:val="p"/>
+                </m:rPr>
+                <m:t>)</m:t>
+              </m:r>
+            </m:oMath>
+            <w:r>
+              <w:t xml:space="preserve"> </w:t>
+            </w:r>
+            <w:r>
+              <w:t xml:space="preserve">(mmHg)</w:t>
+            </w:r>
+          </w:p>
+        </w:tc>
+      </w:tr>
+      <w:tr>
+        <w:tc>
+          <w:tcPr/>
+          <w:p>
+            <w:pPr>
+              <w:pStyle w:val="Compact"/>
+              <w:jc w:val="right"/>
+            </w:pPr>
+            <w:r>
+              <w:t xml:space="preserve">0.150 (nominal)</w:t>
+            </w:r>
+          </w:p>
+        </w:tc>
+        <w:tc>
+          <w:tcPr/>
+          <w:p>
+            <w:pPr>
+              <w:pStyle w:val="Compact"/>
+              <w:jc w:val="right"/>
+            </w:pPr>
+            <w:r>
+              <w:t xml:space="preserve">332</w:t>
+            </w:r>
+          </w:p>
+        </w:tc>
+      </w:tr>
+      <w:tr>
+        <w:tc>
+          <w:tcPr/>
+          <w:p>
+            <w:pPr>
+              <w:pStyle w:val="Compact"/>
+              <w:jc w:val="right"/>
+            </w:pPr>
+            <w:r>
+              <w:t xml:space="preserve">0.050</w:t>
+            </w:r>
+          </w:p>
+        </w:tc>
+        <w:tc>
+          <w:tcPr/>
+          <w:p>
+            <w:pPr>
+              <w:pStyle w:val="Compact"/>
+              <w:jc w:val="right"/>
+            </w:pPr>
+            <w:r>
+              <w:t xml:space="preserve">473</w:t>
+            </w:r>
+          </w:p>
+        </w:tc>
+      </w:tr>
+      <w:tr>
+        <w:tc>
+          <w:tcPr/>
+          <w:p>
+            <w:pPr>
+              <w:pStyle w:val="Compact"/>
+              <w:jc w:val="right"/>
+            </w:pPr>
+            <w:r>
+              <w:t xml:space="preserve">0.015</w:t>
+            </w:r>
+          </w:p>
+        </w:tc>
+        <w:tc>
+          <w:tcPr/>
+          <w:p>
+            <w:pPr>
+              <w:pStyle w:val="Compact"/>
+              <w:jc w:val="right"/>
+            </w:pPr>
+            <w:r>
+              <w:t xml:space="preserve">998</w:t>
+            </w:r>
+          </w:p>
+        </w:tc>
+      </w:tr>
+      <w:tr>
+        <w:tc>
+          <w:tcPr/>
+          <w:p>
+            <w:pPr>
+              <w:pStyle w:val="Compact"/>
+              <w:jc w:val="right"/>
+            </w:pPr>
+            <w:r>
+              <w:t xml:space="preserve">0</w:t>
+            </w:r>
+          </w:p>
+        </w:tc>
+        <w:tc>
+          <w:tcPr/>
+          <w:p>
+            <w:pPr>
+              <w:pStyle w:val="Compact"/>
+              <w:jc w:val="right"/>
+            </w:pPr>
+            <w:r>
+              <w:t xml:space="preserve">degenerate</w:t>
+            </w:r>
+          </w:p>
+        </w:tc>
+      </w:tr>
+    </w:tbl>
+    <w:p>
+      <w:pPr>
+        <w:pStyle w:val="BodyText"/>
+      </w:pPr>
+      <w:r>
+        <w:rPr>
+          <w:b/>
+          <w:bCs/>
+        </w:rPr>
+        <w:t xml:space="preserve">Table 3</w:t>
+      </w:r>
+      <w:r>
+        <w:t xml:space="preserve"> </w:t>
+      </w:r>
+      <w:r>
+        <w:t xml:space="preserve">Cramér-Rao bound on pO</w:t>
+      </w:r>
+      <m:oMath>
+        <m:sSub>
+          <m:e>
+            <m:r>
+              <m:t>​</m:t>
+            </m:r>
+          </m:e>
+          <m:sub>
+            <m:r>
+              <m:t>2</m:t>
+            </m:r>
+          </m:sub>
+        </m:sSub>
+      </m:oMath>
+      <w:r>
+        <w:t xml:space="preserve"> </w:t>
+      </w:r>
+      <w:r>
+        <w:t xml:space="preserve">at pO</w:t>
+      </w:r>
+      <m:oMath>
+        <m:sSub>
+          <m:e>
+            <m:r>
+              <m:t>​</m:t>
+            </m:r>
+          </m:e>
+          <m:sub>
+            <m:r>
+              <m:t>2</m:t>
+            </m:r>
+          </m:sub>
+        </m:sSub>
+      </m:oMath>
+      <w:r>
+        <w:t xml:space="preserve"> </w:t>
+      </w:r>
+      <w:r>
+        <w:t xml:space="preserve">= 20 mmHg,</w:t>
+      </w:r>
+      <w:r>
+        <w:t xml:space="preserve"> </w:t>
+      </w:r>
+      <m:oMath>
+        <m:r>
+          <m:t>f</m:t>
+        </m:r>
+      </m:oMath>
+      <w:r>
+        <w:t xml:space="preserve"> </w:t>
+      </w:r>
+      <w:r>
+        <w:t xml:space="preserve">= 0.10 and</w:t>
+      </w:r>
+      <w:r>
+        <w:t xml:space="preserve"> </w:t>
+      </w:r>
+      <m:oMath>
+        <m:sSup>
+          <m:e>
+            <m:r>
+              <m:t>10</m:t>
+            </m:r>
+          </m:e>
+          <m:sup>
+            <m:r>
+              <m:t>5</m:t>
+            </m:r>
+          </m:sup>
+        </m:sSup>
+      </m:oMath>
+      <w:r>
+        <w:t xml:space="preserve"> </w:t>
+      </w:r>
+      <w:r>
+        <w:t xml:space="preserve">o-Ps counts</w:t>
+      </w:r>
+    </w:p>
+    <w:tbl>
+      <w:tblPr>
+        <w:tblStyle w:val="Table"/>
+        <w:tblW w:type="auto" w:w="0"/>
+        <w:tblLook w:firstRow="1" w:lastRow="0" w:firstColumn="0" w:lastColumn="0" w:noHBand="0" w:noVBand="0" w:val="0020"/>
+      </w:tblPr>
+      <w:tblGrid>
+        <w:gridCol w:w="2640"/>
+        <w:gridCol w:w="2640"/>
+        <w:gridCol w:w="2640"/>
       </w:tblGrid>
       <w:tr>
         <w:trPr>
@@ -5340,7 +6908,7 @@
               <w:pStyle w:val="Compact"/>
             </w:pPr>
             <w:r>
-              <w:t xml:space="preserve">Poisson spectrum, nuisances fixed</w:t>
+              <w:t xml:space="preserve">Poisson, fixed nuisances</w:t>
             </w:r>
           </w:p>
         </w:tc>
@@ -5377,7 +6945,7 @@
               <w:pStyle w:val="Compact"/>
             </w:pPr>
             <w:r>
-              <w:t xml:space="preserve">Idealised two-observable model</w:t>
+              <w:t xml:space="preserve">Idealised two-observable</w:t>
             </w:r>
           </w:p>
         </w:tc>
@@ -5414,7 +6982,7 @@
               <w:pStyle w:val="Compact"/>
             </w:pPr>
             <w:r>
-              <w:t xml:space="preserve">Poisson spectrum, background and fast-component nuisances profiled</w:t>
+              <w:t xml:space="preserve">Poisson, background+fast profiled</w:t>
             </w:r>
           </w:p>
         </w:tc>
@@ -5451,7 +7019,7 @@
               <w:pStyle w:val="Compact"/>
             </w:pPr>
             <w:r>
-              <w:t xml:space="preserve">Poisson spectrum, all tested nuisances profiled</w:t>
+              <w:t xml:space="preserve">Poisson, all nuisances profiled</w:t>
             </w:r>
           </w:p>
         </w:tc>
@@ -5481,8 +7049,427 @@
         </w:tc>
       </w:tr>
     </w:tbl>
+    <w:p>
+      <w:pPr>
+        <w:pStyle w:val="BodyText"/>
+      </w:pPr>
+      <w:r>
+        <w:rPr>
+          <w:b/>
+          <w:bCs/>
+        </w:rPr>
+        <w:t xml:space="preserve">Table 4</w:t>
+      </w:r>
+      <w:r>
+        <w:t xml:space="preserve"> </w:t>
+      </w:r>
+      <w:r>
+        <w:t xml:space="preserve">Stress test of the unmeasured lipid quenching constant in the</w:t>
+      </w:r>
+      <w:r>
+        <w:t xml:space="preserve"> </w:t>
+      </w:r>
+      <m:oMath>
+        <m:sSup>
+          <m:e>
+            <m:r>
+              <m:t>​</m:t>
+            </m:r>
+          </m:e>
+          <m:sup>
+            <m:r>
+              <m:t>124</m:t>
+            </m:r>
+          </m:sup>
+        </m:sSup>
+      </m:oMath>
+      <w:r>
+        <w:t xml:space="preserve">I effective-yield scenario at pO</w:t>
+      </w:r>
+      <m:oMath>
+        <m:sSub>
+          <m:e>
+            <m:r>
+              <m:t>​</m:t>
+            </m:r>
+          </m:e>
+          <m:sub>
+            <m:r>
+              <m:t>2</m:t>
+            </m:r>
+          </m:sub>
+        </m:sSub>
+      </m:oMath>
+      <w:r>
+        <w:t xml:space="preserve"> </w:t>
+      </w:r>
+      <w:r>
+        <w:t xml:space="preserve">= 10 mmHg. Values are ROI volumes needed for</w:t>
+      </w:r>
+      <w:r>
+        <w:t xml:space="preserve"> </w:t>
+      </w:r>
+      <m:oMath>
+        <m:r>
+          <m:t>σ</m:t>
+        </m:r>
+        <m:r>
+          <m:rPr>
+            <m:sty m:val="p"/>
+          </m:rPr>
+          <m:t>(</m:t>
+        </m:r>
+        <m:r>
+          <m:t>p</m:t>
+        </m:r>
+        <m:sSub>
+          <m:e>
+            <m:r>
+              <m:t>O</m:t>
+            </m:r>
+          </m:e>
+          <m:sub>
+            <m:r>
+              <m:t>2</m:t>
+            </m:r>
+          </m:sub>
+        </m:sSub>
+        <m:r>
+          <m:rPr>
+            <m:sty m:val="p"/>
+          </m:rPr>
+          <m:t>)</m:t>
+        </m:r>
+        <m:r>
+          <m:rPr>
+            <m:sty m:val="p"/>
+          </m:rPr>
+          <m:t>≤</m:t>
+        </m:r>
+        <m:r>
+          <m:t>10</m:t>
+        </m:r>
+      </m:oMath>
+      <w:r>
+        <w:t xml:space="preserve"> </w:t>
+      </w:r>
+      <w:r>
+        <w:t xml:space="preserve">mmHg.</w:t>
+      </w:r>
+    </w:p>
+    <w:tbl>
+      <w:tblPr>
+        <w:tblStyle w:val="Table"/>
+        <w:tblW w:type="pct" w:w="5000"/>
+        <w:tblLayout w:type="fixed"/>
+        <w:tblLook w:firstRow="1" w:lastRow="0" w:firstColumn="0" w:lastColumn="0" w:noHBand="0" w:noVBand="0" w:val="0020"/>
+      </w:tblPr>
+      <w:tblGrid>
+        <w:gridCol w:w="2640"/>
+        <w:gridCol w:w="2640"/>
+        <w:gridCol w:w="2640"/>
+      </w:tblGrid>
+      <w:tr>
+        <w:trPr>
+          <w:tblHeader w:val="on"/>
+        </w:trPr>
+        <w:tc>
+          <w:tcPr/>
+          <w:p>
+            <w:pPr>
+              <w:pStyle w:val="Compact"/>
+              <w:jc w:val="right"/>
+            </w:pPr>
+            <m:oMath>
+              <m:sSub>
+                <m:e>
+                  <m:r>
+                    <m:t>κ</m:t>
+                  </m:r>
+                </m:e>
+                <m:sub>
+                  <m:r>
+                    <m:rPr>
+                      <m:sty m:val="p"/>
+                    </m:rPr>
+                    <m:t>l</m:t>
+                  </m:r>
+                  <m:r>
+                    <m:rPr>
+                      <m:sty m:val="p"/>
+                    </m:rPr>
+                    <m:t>i</m:t>
+                  </m:r>
+                  <m:r>
+                    <m:rPr>
+                      <m:sty m:val="p"/>
+                    </m:rPr>
+                    <m:t>p</m:t>
+                  </m:r>
+                  <m:r>
+                    <m:rPr>
+                      <m:sty m:val="p"/>
+                    </m:rPr>
+                    <m:t>i</m:t>
+                  </m:r>
+                  <m:r>
+                    <m:rPr>
+                      <m:sty m:val="p"/>
+                    </m:rPr>
+                    <m:t>d</m:t>
+                  </m:r>
+                </m:sub>
+              </m:sSub>
+              <m:r>
+                <m:rPr>
+                  <m:sty m:val="p"/>
+                </m:rPr>
+                <m:t>/</m:t>
+              </m:r>
+              <m:sSub>
+                <m:e>
+                  <m:r>
+                    <m:t>κ</m:t>
+                  </m:r>
+                </m:e>
+                <m:sub>
+                  <m:r>
+                    <m:rPr>
+                      <m:sty m:val="p"/>
+                    </m:rPr>
+                    <m:t>w</m:t>
+                  </m:r>
+                  <m:r>
+                    <m:rPr>
+                      <m:sty m:val="p"/>
+                    </m:rPr>
+                    <m:t>a</m:t>
+                  </m:r>
+                  <m:r>
+                    <m:rPr>
+                      <m:sty m:val="p"/>
+                    </m:rPr>
+                    <m:t>t</m:t>
+                  </m:r>
+                  <m:r>
+                    <m:rPr>
+                      <m:sty m:val="p"/>
+                    </m:rPr>
+                    <m:t>e</m:t>
+                  </m:r>
+                  <m:r>
+                    <m:rPr>
+                      <m:sty m:val="p"/>
+                    </m:rPr>
+                    <m:t>r</m:t>
+                  </m:r>
+                </m:sub>
+              </m:sSub>
+            </m:oMath>
+          </w:p>
+        </w:tc>
+        <w:tc>
+          <w:tcPr/>
+          <w:p>
+            <w:pPr>
+              <w:pStyle w:val="Compact"/>
+              <w:jc w:val="right"/>
+            </w:pPr>
+            <m:oMath>
+              <m:r>
+                <m:t>f</m:t>
+              </m:r>
+              <m:r>
+                <m:rPr>
+                  <m:sty m:val="p"/>
+                </m:rPr>
+                <m:t>=</m:t>
+              </m:r>
+              <m:r>
+                <m:t>0.60</m:t>
+              </m:r>
+            </m:oMath>
+          </w:p>
+        </w:tc>
+        <w:tc>
+          <w:tcPr/>
+          <w:p>
+            <w:pPr>
+              <w:pStyle w:val="Compact"/>
+              <w:jc w:val="right"/>
+            </w:pPr>
+            <m:oMath>
+              <m:r>
+                <m:t>f</m:t>
+              </m:r>
+              <m:r>
+                <m:rPr>
+                  <m:sty m:val="p"/>
+                </m:rPr>
+                <m:t>=</m:t>
+              </m:r>
+              <m:r>
+                <m:t>0.05</m:t>
+              </m:r>
+            </m:oMath>
+          </w:p>
+        </w:tc>
+      </w:tr>
+      <w:tr>
+        <w:tc>
+          <w:tcPr/>
+          <w:p>
+            <w:pPr>
+              <w:pStyle w:val="Compact"/>
+              <w:jc w:val="right"/>
+            </w:pPr>
+            <w:r>
+              <w:t xml:space="preserve">0.3 (central baseline)</w:t>
+            </w:r>
+          </w:p>
+        </w:tc>
+        <w:tc>
+          <w:tcPr/>
+          <w:p>
+            <w:pPr>
+              <w:pStyle w:val="Compact"/>
+              <w:jc w:val="right"/>
+            </w:pPr>
+            <w:r>
+              <w:t xml:space="preserve">5.1 L</w:t>
+            </w:r>
+          </w:p>
+        </w:tc>
+        <w:tc>
+          <w:tcPr/>
+          <w:p>
+            <w:pPr>
+              <w:pStyle w:val="Compact"/>
+              <w:jc w:val="right"/>
+            </w:pPr>
+            <w:r>
+              <w:t xml:space="preserve">19.6 L</w:t>
+            </w:r>
+          </w:p>
+        </w:tc>
+      </w:tr>
+      <w:tr>
+        <w:tc>
+          <w:tcPr/>
+          <w:p>
+            <w:pPr>
+              <w:pStyle w:val="Compact"/>
+              <w:jc w:val="right"/>
+            </w:pPr>
+            <w:r>
+              <w:t xml:space="preserve">1.0 (water-value baseline)</w:t>
+            </w:r>
+          </w:p>
+        </w:tc>
+        <w:tc>
+          <w:tcPr/>
+          <w:p>
+            <w:pPr>
+              <w:pStyle w:val="Compact"/>
+              <w:jc w:val="right"/>
+            </w:pPr>
+            <w:r>
+              <w:t xml:space="preserve">0.75 L</w:t>
+            </w:r>
+          </w:p>
+        </w:tc>
+        <w:tc>
+          <w:tcPr/>
+          <w:p>
+            <w:pPr>
+              <w:pStyle w:val="Compact"/>
+              <w:jc w:val="right"/>
+            </w:pPr>
+            <w:r>
+              <w:t xml:space="preserve">14.3 L</w:t>
+            </w:r>
+          </w:p>
+        </w:tc>
+      </w:tr>
+      <w:tr>
+        <w:tc>
+          <w:tcPr/>
+          <w:p>
+            <w:pPr>
+              <w:pStyle w:val="Compact"/>
+              <w:jc w:val="right"/>
+            </w:pPr>
+            <w:r>
+              <w:t xml:space="preserve">3.0 (high stress test)</w:t>
+            </w:r>
+          </w:p>
+        </w:tc>
+        <w:tc>
+          <w:tcPr/>
+          <w:p>
+            <w:pPr>
+              <w:pStyle w:val="Compact"/>
+              <w:jc w:val="right"/>
+            </w:pPr>
+            <w:r>
+              <w:t xml:space="preserve">98 mL</w:t>
+            </w:r>
+          </w:p>
+        </w:tc>
+        <w:tc>
+          <w:tcPr/>
+          <w:p>
+            <w:pPr>
+              <w:pStyle w:val="Compact"/>
+              <w:jc w:val="right"/>
+            </w:pPr>
+            <w:r>
+              <w:t xml:space="preserve">7.1 L</w:t>
+            </w:r>
+          </w:p>
+        </w:tc>
+      </w:tr>
+      <w:tr>
+        <w:tc>
+          <w:tcPr/>
+          <w:p>
+            <w:pPr>
+              <w:pStyle w:val="Compact"/>
+              <w:jc w:val="right"/>
+            </w:pPr>
+            <w:r>
+              <w:t xml:space="preserve">10 (organic-liquid stress test)</w:t>
+            </w:r>
+          </w:p>
+        </w:tc>
+        <w:tc>
+          <w:tcPr/>
+          <w:p>
+            <w:pPr>
+              <w:pStyle w:val="Compact"/>
+              <w:jc w:val="right"/>
+            </w:pPr>
+            <w:r>
+              <w:t xml:space="preserve">9.5 mL</w:t>
+            </w:r>
+          </w:p>
+        </w:tc>
+        <w:tc>
+          <w:tcPr/>
+          <w:p>
+            <w:pPr>
+              <w:pStyle w:val="Compact"/>
+              <w:jc w:val="right"/>
+            </w:pPr>
+            <w:r>
+              <w:t xml:space="preserve">1.7 L</w:t>
+            </w:r>
+          </w:p>
+        </w:tc>
+      </w:tr>
+    </w:tbl>
     <w:bookmarkEnd w:id="25"/>
-    <w:bookmarkStart w:id="44" w:name="figure-legends"/>
+    <w:bookmarkStart w:id="26" w:name="figure-legends"/>
     <w:p>
       <w:pPr>
         <w:pStyle w:val="Heading2"/>
@@ -5534,53 +7521,6 @@
         <w:pStyle w:val="BodyText"/>
       </w:pPr>
       <w:r>
-        <w:drawing>
-          <wp:inline>
-            <wp:extent cx="4160520" cy="3086837"/>
-            <wp:effectExtent b="0" l="0" r="0" t="0"/>
-            <wp:docPr descr="" title="" id="27" name="Picture"/>
-            <a:graphic>
-              <a:graphicData uri="http://schemas.openxmlformats.org/drawingml/2006/picture">
-                <pic:pic>
-                  <pic:nvPicPr>
-                    <pic:cNvPr descr="figures/fig1_bias_surface.png" id="28" name="Picture"/>
-                    <pic:cNvPicPr>
-                      <a:picLocks noChangeArrowheads="1" noChangeAspect="1"/>
-                    </pic:cNvPicPr>
-                  </pic:nvPicPr>
-                  <pic:blipFill>
-                    <a:blip r:embed="rId26"/>
-                    <a:stretch>
-                      <a:fillRect/>
-                    </a:stretch>
-                  </pic:blipFill>
-                  <pic:spPr bwMode="auto">
-                    <a:xfrm>
-                      <a:off x="0" y="0"/>
-                      <a:ext cx="4160520" cy="3086837"/>
-                    </a:xfrm>
-                    <a:prstGeom prst="rect">
-                      <a:avLst/>
-                    </a:prstGeom>
-                    <a:noFill/>
-                    <a:ln w="9525">
-                      <a:noFill/>
-                      <a:headEnd/>
-                      <a:tailEnd/>
-                    </a:ln>
-                  </pic:spPr>
-                </pic:pic>
-              </a:graphicData>
-            </a:graphic>
-          </wp:inline>
-        </w:drawing>
-      </w:r>
-    </w:p>
-    <w:p>
-      <w:pPr>
-        <w:pStyle w:val="BodyText"/>
-      </w:pPr>
-      <w:r>
         <w:rPr>
           <w:b/>
           <w:bCs/>
@@ -5591,7 +7531,7 @@
         <w:t xml:space="preserve"> </w:t>
       </w:r>
       <w:r>
-        <w:t xml:space="preserve">Oxygen sensitivity of the o-Ps lifetime as a function of lipid fraction. The band represents the sweep over the unmeasured lipid quenching constant</w:t>
+        <w:t xml:space="preserve">Oxygen sensitivity of the o-Ps lifetime as a function of lipid fraction. The band represents the conservative baseline sweep over the unmeasured lipid quenching constant</w:t>
       </w:r>
       <w:r>
         <w:t xml:space="preserve"> </w:t>
@@ -5641,54 +7581,35 @@
         <w:t xml:space="preserve"> </w:t>
       </w:r>
       <w:r>
-        <w:t xml:space="preserve">from 0.1 to 1.0 times the water value</w:t>
-      </w:r>
-    </w:p>
-    <w:p>
-      <w:pPr>
-        <w:pStyle w:val="BodyText"/>
-      </w:pPr>
-      <w:r>
-        <w:drawing>
-          <wp:inline>
-            <wp:extent cx="3733800" cy="2738120"/>
-            <wp:effectExtent b="0" l="0" r="0" t="0"/>
-            <wp:docPr descr="" title="" id="30" name="Picture"/>
-            <a:graphic>
-              <a:graphicData uri="http://schemas.openxmlformats.org/drawingml/2006/picture">
-                <pic:pic>
-                  <pic:nvPicPr>
-                    <pic:cNvPr descr="figures/fig2_sensitivity.png" id="31" name="Picture"/>
-                    <pic:cNvPicPr>
-                      <a:picLocks noChangeArrowheads="1" noChangeAspect="1"/>
-                    </pic:cNvPicPr>
-                  </pic:nvPicPr>
-                  <pic:blipFill>
-                    <a:blip r:embed="rId29"/>
-                    <a:stretch>
-                      <a:fillRect/>
-                    </a:stretch>
-                  </pic:blipFill>
-                  <pic:spPr bwMode="auto">
-                    <a:xfrm>
-                      <a:off x="0" y="0"/>
-                      <a:ext cx="3733800" cy="2738120"/>
-                    </a:xfrm>
-                    <a:prstGeom prst="rect">
-                      <a:avLst/>
-                    </a:prstGeom>
-                    <a:noFill/>
-                    <a:ln w="9525">
-                      <a:noFill/>
-                      <a:headEnd/>
-                      <a:tailEnd/>
-                    </a:ln>
-                  </pic:spPr>
-                </pic:pic>
-              </a:graphicData>
-            </a:graphic>
-          </wp:inline>
-        </w:drawing>
+        <w:t xml:space="preserve">from 0.1 to 1.0 times the water value; dashed/dotted curves show the 3</w:t>
+      </w:r>
+      <m:oMath>
+        <m:r>
+          <m:rPr>
+            <m:sty m:val="p"/>
+          </m:rPr>
+          <m:t>×</m:t>
+        </m:r>
+      </m:oMath>
+      <w:r>
+        <w:t xml:space="preserve"> </w:t>
+      </w:r>
+      <w:r>
+        <w:t xml:space="preserve">and 10</w:t>
+      </w:r>
+      <m:oMath>
+        <m:r>
+          <m:rPr>
+            <m:sty m:val="p"/>
+          </m:rPr>
+          <m:t>×</m:t>
+        </m:r>
+      </m:oMath>
+      <w:r>
+        <w:t xml:space="preserve"> </w:t>
+      </w:r>
+      <w:r>
+        <w:t xml:space="preserve">high-stress cases used in Table 4.</w:t>
       </w:r>
     </w:p>
     <w:p>
@@ -5804,53 +7725,6 @@
         <w:pStyle w:val="BodyText"/>
       </w:pPr>
       <w:r>
-        <w:drawing>
-          <wp:inline>
-            <wp:extent cx="4160520" cy="3086837"/>
-            <wp:effectExtent b="0" l="0" r="0" t="0"/>
-            <wp:docPr descr="" title="" id="33" name="Picture"/>
-            <a:graphic>
-              <a:graphicData uri="http://schemas.openxmlformats.org/drawingml/2006/picture">
-                <pic:pic>
-                  <pic:nvPicPr>
-                    <pic:cNvPr descr="figures/fig4_degeneracy.png" id="34" name="Picture"/>
-                    <pic:cNvPicPr>
-                      <a:picLocks noChangeArrowheads="1" noChangeAspect="1"/>
-                    </pic:cNvPicPr>
-                  </pic:nvPicPr>
-                  <pic:blipFill>
-                    <a:blip r:embed="rId32"/>
-                    <a:stretch>
-                      <a:fillRect/>
-                    </a:stretch>
-                  </pic:blipFill>
-                  <pic:spPr bwMode="auto">
-                    <a:xfrm>
-                      <a:off x="0" y="0"/>
-                      <a:ext cx="4160520" cy="3086837"/>
-                    </a:xfrm>
-                    <a:prstGeom prst="rect">
-                      <a:avLst/>
-                    </a:prstGeom>
-                    <a:noFill/>
-                    <a:ln w="9525">
-                      <a:noFill/>
-                      <a:headEnd/>
-                      <a:tailEnd/>
-                    </a:ln>
-                  </pic:spPr>
-                </pic:pic>
-              </a:graphicData>
-            </a:graphic>
-          </wp:inline>
-        </w:drawing>
-      </w:r>
-    </w:p>
-    <w:p>
-      <w:pPr>
-        <w:pStyle w:val="BodyText"/>
-      </w:pPr>
-      <w:r>
         <w:rPr>
           <w:b/>
           <w:bCs/>
@@ -5902,7 +7776,7 @@
         <w:t xml:space="preserve"> </w:t>
       </w:r>
       <w:r>
-        <w:t xml:space="preserve">versus total in-window events for the full-spectrum</w:t>
+        <w:t xml:space="preserve">versus total in-window events for the fixed-nuisance full-spectrum</w:t>
       </w:r>
       <w:r>
         <w:t xml:space="preserve"> </w:t>
@@ -6156,54 +8030,7 @@
         <w:t xml:space="preserve"> </w:t>
       </w:r>
       <w:r>
-        <w:t xml:space="preserve">conversion</w:t>
-      </w:r>
-    </w:p>
-    <w:p>
-      <w:pPr>
-        <w:pStyle w:val="BodyText"/>
-      </w:pPr>
-      <w:r>
-        <w:drawing>
-          <wp:inline>
-            <wp:extent cx="3733800" cy="2738120"/>
-            <wp:effectExtent b="0" l="0" r="0" t="0"/>
-            <wp:docPr descr="" title="" id="36" name="Picture"/>
-            <a:graphic>
-              <a:graphicData uri="http://schemas.openxmlformats.org/drawingml/2006/picture">
-                <pic:pic>
-                  <pic:nvPicPr>
-                    <pic:cNvPr descr="figures/fig3_separability.png" id="37" name="Picture"/>
-                    <pic:cNvPicPr>
-                      <a:picLocks noChangeArrowheads="1" noChangeAspect="1"/>
-                    </pic:cNvPicPr>
-                  </pic:nvPicPr>
-                  <pic:blipFill>
-                    <a:blip r:embed="rId35"/>
-                    <a:stretch>
-                      <a:fillRect/>
-                    </a:stretch>
-                  </pic:blipFill>
-                  <pic:spPr bwMode="auto">
-                    <a:xfrm>
-                      <a:off x="0" y="0"/>
-                      <a:ext cx="3733800" cy="2738120"/>
-                    </a:xfrm>
-                    <a:prstGeom prst="rect">
-                      <a:avLst/>
-                    </a:prstGeom>
-                    <a:noFill/>
-                    <a:ln w="9525">
-                      <a:noFill/>
-                      <a:headEnd/>
-                      <a:tailEnd/>
-                    </a:ln>
-                  </pic:spPr>
-                </pic:pic>
-              </a:graphicData>
-            </a:graphic>
-          </wp:inline>
-        </w:drawing>
+        <w:t xml:space="preserve">conversion.</w:t>
       </w:r>
     </w:p>
     <w:p>
@@ -6299,53 +8126,6 @@
         <w:pStyle w:val="BodyText"/>
       </w:pPr>
       <w:r>
-        <w:drawing>
-          <wp:inline>
-            <wp:extent cx="3840480" cy="2849388"/>
-            <wp:effectExtent b="0" l="0" r="0" t="0"/>
-            <wp:docPr descr="" title="" id="39" name="Picture"/>
-            <a:graphic>
-              <a:graphicData uri="http://schemas.openxmlformats.org/drawingml/2006/picture">
-                <pic:pic>
-                  <pic:nvPicPr>
-                    <pic:cNvPr descr="figures/fig5_boundary.png" id="40" name="Picture"/>
-                    <pic:cNvPicPr>
-                      <a:picLocks noChangeArrowheads="1" noChangeAspect="1"/>
-                    </pic:cNvPicPr>
-                  </pic:nvPicPr>
-                  <pic:blipFill>
-                    <a:blip r:embed="rId38"/>
-                    <a:stretch>
-                      <a:fillRect/>
-                    </a:stretch>
-                  </pic:blipFill>
-                  <pic:spPr bwMode="auto">
-                    <a:xfrm>
-                      <a:off x="0" y="0"/>
-                      <a:ext cx="3840480" cy="2849388"/>
-                    </a:xfrm>
-                    <a:prstGeom prst="rect">
-                      <a:avLst/>
-                    </a:prstGeom>
-                    <a:noFill/>
-                    <a:ln w="9525">
-                      <a:noFill/>
-                      <a:headEnd/>
-                      <a:tailEnd/>
-                    </a:ln>
-                  </pic:spPr>
-                </pic:pic>
-              </a:graphicData>
-            </a:graphic>
-          </wp:inline>
-        </w:drawing>
-      </w:r>
-    </w:p>
-    <w:p>
-      <w:pPr>
-        <w:pStyle w:val="BodyText"/>
-      </w:pPr>
-      <w:r>
         <w:rPr>
           <w:b/>
           <w:bCs/>
@@ -6396,55 +8176,8 @@
         <w:t xml:space="preserve">separation is not achievable anywhere at native voxel scale</w:t>
       </w:r>
     </w:p>
-    <w:p>
-      <w:pPr>
-        <w:pStyle w:val="BodyText"/>
-      </w:pPr>
-      <w:r>
-        <w:drawing>
-          <wp:inline>
-            <wp:extent cx="5067300" cy="2313332"/>
-            <wp:effectExtent b="0" l="0" r="0" t="0"/>
-            <wp:docPr descr="" title="" id="42" name="Picture"/>
-            <a:graphic>
-              <a:graphicData uri="http://schemas.openxmlformats.org/drawingml/2006/picture">
-                <pic:pic>
-                  <pic:nvPicPr>
-                    <pic:cNvPr descr="figures/fig6_tumor_map.png" id="43" name="Picture"/>
-                    <pic:cNvPicPr>
-                      <a:picLocks noChangeArrowheads="1" noChangeAspect="1"/>
-                    </pic:cNvPicPr>
-                  </pic:nvPicPr>
-                  <pic:blipFill>
-                    <a:blip r:embed="rId41"/>
-                    <a:stretch>
-                      <a:fillRect/>
-                    </a:stretch>
-                  </pic:blipFill>
-                  <pic:spPr bwMode="auto">
-                    <a:xfrm>
-                      <a:off x="0" y="0"/>
-                      <a:ext cx="5067300" cy="2313332"/>
-                    </a:xfrm>
-                    <a:prstGeom prst="rect">
-                      <a:avLst/>
-                    </a:prstGeom>
-                    <a:noFill/>
-                    <a:ln w="9525">
-                      <a:noFill/>
-                      <a:headEnd/>
-                      <a:tailEnd/>
-                    </a:ln>
-                  </pic:spPr>
-                </pic:pic>
-              </a:graphicData>
-            </a:graphic>
-          </wp:inline>
-        </w:drawing>
-      </w:r>
-    </w:p>
-    <w:bookmarkEnd w:id="44"/>
-    <w:bookmarkStart w:id="45" w:name="supplementary-information"/>
+    <w:bookmarkEnd w:id="26"/>
+    <w:bookmarkStart w:id="27" w:name="supplementary-information"/>
     <w:p>
       <w:pPr>
         <w:pStyle w:val="Heading2"/>
@@ -6539,8 +8272,8 @@
         <w:t xml:space="preserve">, showing that the maximum-likelihood estimator reaches the fixed-nuisance CRLB when the forward model is correctly specified.</w:t>
       </w:r>
     </w:p>
-    <w:bookmarkEnd w:id="45"/>
-    <w:bookmarkEnd w:id="46"/>
+    <w:bookmarkEnd w:id="27"/>
+    <w:bookmarkEnd w:id="28"/>
     <w:sectPr>
       <w:footnotePr>
         <w:numRestart w:val="eachSect"/>

</xml_diff>

<commit_message>
Update affiliations to Zapopan
</commit_message>
<xml_diff>
--- a/paper/manuscript_ejnmmi.docx
+++ b/paper/manuscript_ejnmmi.docx
@@ -68,7 +68,7 @@
         </w:numPr>
       </w:pPr>
       <w:r>
-        <w:t xml:space="preserve">Universidad Panamericana, Guadalajara, Mexico.</w:t>
+        <w:t xml:space="preserve">Universidad Panamericana, Zapopan, Mexico.</w:t>
       </w:r>
     </w:p>
     <w:p>
@@ -80,7 +80,7 @@
         </w:numPr>
       </w:pPr>
       <w:r>
-        <w:t xml:space="preserve">Universidad de Guadalajara, Guadalajara, Mexico.</w:t>
+        <w:t xml:space="preserve">Universidad de Guadalajara, Zapopan, Mexico.</w:t>
       </w:r>
     </w:p>
     <w:p>

</xml_diff>